<commit_message>
Justify text, drop APA 7 from header, add positioning column to all tables
Co-Authored-By: Claude Opus 5.5 <noreply@anthropic.com>
Claude-Session: https://claude.ai/code/session_01Emt8uw1GVwwbB5CLx64szz
</commit_message>
<xml_diff>
--- a/literature-review/Literature-Review_Melen.docx
+++ b/literature-review/Literature-Review_Melen.docx
@@ -20,6 +20,7 @@
     <w:p>
       <w:pPr>
         <w:spacing w:after="240" w:line="264"/>
+        <w:jc w:val="left"/>
       </w:pPr>
       <w:r>
         <w:rPr>
@@ -49,6 +50,7 @@
     <w:p>
       <w:pPr>
         <w:spacing w:after="160" w:line="264"/>
+        <w:jc w:val="both"/>
       </w:pPr>
       <w:r>
         <w:rPr>
@@ -62,6 +64,7 @@
     <w:p>
       <w:pPr>
         <w:spacing w:after="160" w:line="264"/>
+        <w:jc w:val="both"/>
       </w:pPr>
       <w:r>
         <w:rPr>
@@ -75,6 +78,7 @@
     <w:p>
       <w:pPr>
         <w:spacing w:after="160" w:line="264"/>
+        <w:jc w:val="both"/>
       </w:pPr>
       <w:r>
         <w:rPr>
@@ -88,6 +92,7 @@
     <w:p>
       <w:pPr>
         <w:spacing w:after="160" w:line="264"/>
+        <w:jc w:val="both"/>
       </w:pPr>
       <w:r>
         <w:rPr>
@@ -101,6 +106,7 @@
     <w:p>
       <w:pPr>
         <w:spacing w:after="240" w:line="264"/>
+        <w:jc w:val="left"/>
       </w:pPr>
       <w:r>
         <w:rPr>
@@ -130,6 +136,7 @@
     <w:p>
       <w:pPr>
         <w:spacing w:after="160" w:line="264"/>
+        <w:jc w:val="both"/>
       </w:pPr>
       <w:r>
         <w:rPr>
@@ -143,6 +150,7 @@
     <w:p>
       <w:pPr>
         <w:spacing w:after="160" w:line="264"/>
+        <w:jc w:val="both"/>
       </w:pPr>
       <w:r>
         <w:rPr>
@@ -220,7 +228,7 @@
                 <w:sz w:val="18"/>
                 <w:szCs w:val="18"/>
               </w:rPr>
-              <w:t xml:space="preserve">Source (APA 7)</w:t>
+              <w:t xml:space="preserve">Source</w:t>
             </w:r>
           </w:p>
         </w:tc>
@@ -1274,7 +1282,7 @@
                 <w:sz w:val="18"/>
                 <w:szCs w:val="18"/>
               </w:rPr>
-              <w:t xml:space="preserve">On p. 32, Deleuze writes that the prison "constitutes a visibility" and is "a system of light before being a figure of stone", and introduces Foucault's distinction between "the visible and the articulable". The register of knowledge in this research can be discussed through this distinction. Architectural approach: weak.</w:t>
+              <w:t xml:space="preserve">On p. 32, Deleuze writes that the prison "constitutes a visibility" and is "a system of light before being a figure of stone", and introduces Foucault's distinction between "the visible and the articulable". The register of knowledge in this research can be discussed through this distinction.</w:t>
             </w:r>
           </w:p>
         </w:tc>
@@ -1299,6 +1307,14 @@
               <w:keepLines w:val="false"/>
               <w:spacing w:after="0" w:line="240"/>
             </w:pPr>
+            <w:r>
+              <w:rPr>
+                <w:rFonts w:ascii="Urbanist" w:cs="Urbanist" w:eastAsia="Urbanist" w:hAnsi="Urbanist"/>
+                <w:sz w:val="18"/>
+                <w:szCs w:val="18"/>
+              </w:rPr>
+              <w:t xml:space="preserve">Architectural approach: Weak</w:t>
+            </w:r>
           </w:p>
         </w:tc>
         <w:tc>
@@ -1446,7 +1462,7 @@
                 <w:sz w:val="18"/>
                 <w:szCs w:val="18"/>
               </w:rPr>
-              <w:t xml:space="preserve">According to the publisher's abstract, in the old city of Mardin "the transition to centralized modern supply" transformed "the visibility, accessibility, use, and situated knowledge of water", and the study reconstructs the relationships "between partially concealed infrastructure and visible urban form". Architectural approach: strong.</w:t>
+              <w:t xml:space="preserve">According to the publisher's abstract, in the old city of Mardin "the transition to centralized modern supply" transformed "the visibility, accessibility, use, and situated knowledge of water", and the study reconstructs the relationships "between partially concealed infrastructure and visible urban form".</w:t>
             </w:r>
           </w:p>
         </w:tc>
@@ -1471,6 +1487,14 @@
               <w:keepLines w:val="false"/>
               <w:spacing w:after="0" w:line="240"/>
             </w:pPr>
+            <w:r>
+              <w:rPr>
+                <w:rFonts w:ascii="Urbanist" w:cs="Urbanist" w:eastAsia="Urbanist" w:hAnsi="Urbanist"/>
+                <w:sz w:val="18"/>
+                <w:szCs w:val="18"/>
+              </w:rPr>
+              <w:t xml:space="preserve">Architectural approach: Strong</w:t>
+            </w:r>
           </w:p>
         </w:tc>
         <w:tc>
@@ -1618,7 +1642,7 @@
                 <w:sz w:val="18"/>
                 <w:szCs w:val="18"/>
               </w:rPr>
-              <w:t xml:space="preserve">According to the abstract, the article draws on "translation theory, which is essentially about the reinterpretation, appropriation, and representation of interests related to materials", and shows that "the translation of the underground by project actors hampered the necessary relocation of utilities". The register of knowledge can be traced in this account of underground utilities. Architectural approach: weak.</w:t>
+              <w:t xml:space="preserve">According to the abstract, the article draws on "translation theory, which is essentially about the reinterpretation, appropriation, and representation of interests related to materials", and shows that "the translation of the underground by project actors hampered the necessary relocation of utilities". The register of knowledge can be traced in this account of underground utilities.</w:t>
             </w:r>
           </w:p>
         </w:tc>
@@ -1643,6 +1667,14 @@
               <w:keepLines w:val="false"/>
               <w:spacing w:after="0" w:line="240"/>
             </w:pPr>
+            <w:r>
+              <w:rPr>
+                <w:rFonts w:ascii="Urbanist" w:cs="Urbanist" w:eastAsia="Urbanist" w:hAnsi="Urbanist"/>
+                <w:sz w:val="18"/>
+                <w:szCs w:val="18"/>
+              </w:rPr>
+              <w:t xml:space="preserve">Architectural approach: Weak</w:t>
+            </w:r>
           </w:p>
         </w:tc>
         <w:tc>
@@ -1772,7 +1804,7 @@
                 <w:sz w:val="18"/>
                 <w:szCs w:val="18"/>
               </w:rPr>
-              <w:t xml:space="preserve">According to the publisher's abstract, the authors "emphasize the role of invisibility in the process by which classification orders human interaction", examine "how categories are made and kept invisible, and how people can change this invisibility when necessary", and treat systems of classification "as part of the built information environment". The register of knowledge can be traced through this account of classification. Architectural approach: weak.</w:t>
+              <w:t xml:space="preserve">According to the publisher's abstract, the authors "emphasize the role of invisibility in the process by which classification orders human interaction", examine "how categories are made and kept invisible, and how people can change this invisibility when necessary", and treat systems of classification "as part of the built information environment". The register of knowledge can be traced through this account of classification.</w:t>
             </w:r>
           </w:p>
         </w:tc>
@@ -1797,6 +1829,14 @@
               <w:keepLines w:val="false"/>
               <w:spacing w:after="0" w:line="240"/>
             </w:pPr>
+            <w:r>
+              <w:rPr>
+                <w:rFonts w:ascii="Urbanist" w:cs="Urbanist" w:eastAsia="Urbanist" w:hAnsi="Urbanist"/>
+                <w:sz w:val="18"/>
+                <w:szCs w:val="18"/>
+              </w:rPr>
+              <w:t xml:space="preserve">Architectural approach: Weak</w:t>
+            </w:r>
           </w:p>
         </w:tc>
         <w:tc>
@@ -1926,7 +1966,7 @@
                 <w:sz w:val="18"/>
                 <w:szCs w:val="18"/>
               </w:rPr>
-              <w:t xml:space="preserve">According to the publisher's description, rivers are treated as "products of human design and a particular way of seeing that has roots stretching as far back as ancient Greek cartography", and the book traces how the Ganges "has been pictured, mapped, surveyed, explored, and measured across the millennia"; its first chapter is titled "Alexander's Eye and Ganga's Descent". The register of representation can be discussed through this way of seeing. Architectural approach: strong.</w:t>
+              <w:t xml:space="preserve">According to the publisher's description, rivers are treated as "products of human design and a particular way of seeing that has roots stretching as far back as ancient Greek cartography", and the book traces how the Ganges "has been pictured, mapped, surveyed, explored, and measured across the millennia"; its first chapter is titled "Alexander's Eye and Ganga's Descent". The register of representation can be discussed through this way of seeing.</w:t>
             </w:r>
           </w:p>
         </w:tc>
@@ -1951,6 +1991,14 @@
               <w:keepLines w:val="false"/>
               <w:spacing w:after="0" w:line="240"/>
             </w:pPr>
+            <w:r>
+              <w:rPr>
+                <w:rFonts w:ascii="Urbanist" w:cs="Urbanist" w:eastAsia="Urbanist" w:hAnsi="Urbanist"/>
+                <w:sz w:val="18"/>
+                <w:szCs w:val="18"/>
+              </w:rPr>
+              <w:t xml:space="preserve">Architectural approach: Strong</w:t>
+            </w:r>
           </w:p>
         </w:tc>
         <w:tc>
@@ -2080,7 +2128,7 @@
                 <w:sz w:val="18"/>
                 <w:szCs w:val="18"/>
               </w:rPr>
-              <w:t xml:space="preserve">According to the publisher's description, "infrastructure sets the invisible rules that govern the spaces of our everyday lives", and the book reveals governmental and corporate forces "buried within the concrete and fiber-optics of our modern habitat". The register of knowledge can be discussed in relation to these "invisible rules" of infrastructure space. Architectural approach: strong.</w:t>
+              <w:t xml:space="preserve">According to the publisher's description, "infrastructure sets the invisible rules that govern the spaces of our everyday lives", and the book reveals governmental and corporate forces "buried within the concrete and fiber-optics of our modern habitat". The register of knowledge can be discussed in relation to these "invisible rules" of infrastructure space.</w:t>
             </w:r>
           </w:p>
         </w:tc>
@@ -2105,6 +2153,14 @@
               <w:keepLines w:val="false"/>
               <w:spacing w:after="0" w:line="240"/>
             </w:pPr>
+            <w:r>
+              <w:rPr>
+                <w:rFonts w:ascii="Urbanist" w:cs="Urbanist" w:eastAsia="Urbanist" w:hAnsi="Urbanist"/>
+                <w:sz w:val="18"/>
+                <w:szCs w:val="18"/>
+              </w:rPr>
+              <w:t xml:space="preserve">Architectural approach: Strong</w:t>
+            </w:r>
           </w:p>
         </w:tc>
         <w:tc>
@@ -2234,7 +2290,7 @@
                 <w:sz w:val="18"/>
                 <w:szCs w:val="18"/>
               </w:rPr>
-              <w:t xml:space="preserve">According to the publisher's abstract, water lies "at the intersection of landscape and infrastructure, crossing between visible and invisible domains of urban space"; the book begins with "the Parisian sewers of the nineteenth century, captured in the photographs of Nadar" and addresses Berlin's "protection of public access to lakes for swimming". The registers of representation and access can be read in these cases. Architectural approach: strong.</w:t>
+              <w:t xml:space="preserve">According to the publisher's abstract, water lies "at the intersection of landscape and infrastructure, crossing between visible and invisible domains of urban space"; the book begins with "the Parisian sewers of the nineteenth century, captured in the photographs of Nadar" and addresses Berlin's "protection of public access to lakes for swimming". The registers of representation and access can be read in these cases.</w:t>
             </w:r>
           </w:p>
         </w:tc>
@@ -2259,6 +2315,14 @@
               <w:keepLines w:val="false"/>
               <w:spacing w:after="0" w:line="240"/>
             </w:pPr>
+            <w:r>
+              <w:rPr>
+                <w:rFonts w:ascii="Urbanist" w:cs="Urbanist" w:eastAsia="Urbanist" w:hAnsi="Urbanist"/>
+                <w:sz w:val="18"/>
+                <w:szCs w:val="18"/>
+              </w:rPr>
+              <w:t xml:space="preserve">Architectural approach: Strong</w:t>
+            </w:r>
           </w:p>
         </w:tc>
         <w:tc>
@@ -2388,7 +2452,7 @@
                 <w:sz w:val="18"/>
                 <w:szCs w:val="18"/>
               </w:rPr>
-              <w:t xml:space="preserve">The publisher's description opens with the question: "How are the far-away, invisible landscapes where materials come from related to the highly visible, urban landscapes where those same materials are installed?" The book traces five construction materials "from seminal public landscapes in New York City, back to where they came from". Architectural approach: strong.</w:t>
+              <w:t xml:space="preserve">The publisher's description opens with the question: "How are the far-away, invisible landscapes where materials come from related to the highly visible, urban landscapes where those same materials are installed?" The book traces five construction materials "from seminal public landscapes in New York City, back to where they came from".</w:t>
             </w:r>
           </w:p>
         </w:tc>
@@ -2413,6 +2477,14 @@
               <w:keepLines w:val="false"/>
               <w:spacing w:after="0" w:line="240"/>
             </w:pPr>
+            <w:r>
+              <w:rPr>
+                <w:rFonts w:ascii="Urbanist" w:cs="Urbanist" w:eastAsia="Urbanist" w:hAnsi="Urbanist"/>
+                <w:sz w:val="18"/>
+                <w:szCs w:val="18"/>
+              </w:rPr>
+              <w:t xml:space="preserve">Architectural approach: Strong</w:t>
+            </w:r>
           </w:p>
         </w:tc>
         <w:tc>
@@ -2560,7 +2632,7 @@
                 <w:sz w:val="18"/>
                 <w:szCs w:val="18"/>
               </w:rPr>
-              <w:t xml:space="preserve">According to the publisher's abstract, the article analyses "the iconography and symbolism of dam constructions" through the Marathon dam, which "became an iconic marker of Athens's modernization" and was "veneered with the same marble as that used for the Parthenon", read as an effort "to reconcile iconographically the two prevailing geographical imaginations" of the city. The register of representation can be located in this reading of the dam as architecture. Architectural approach: strong.</w:t>
+              <w:t xml:space="preserve">According to the publisher's abstract, the article analyses "the iconography and symbolism of dam constructions" through the Marathon dam, which "became an iconic marker of Athens's modernization" and was "veneered with the same marble as that used for the Parthenon", read as an effort "to reconcile iconographically the two prevailing geographical imaginations" of the city. The register of representation can be located in this reading of the dam as architecture.</w:t>
             </w:r>
           </w:p>
         </w:tc>
@@ -2585,6 +2657,14 @@
               <w:keepLines w:val="false"/>
               <w:spacing w:after="0" w:line="240"/>
             </w:pPr>
+            <w:r>
+              <w:rPr>
+                <w:rFonts w:ascii="Urbanist" w:cs="Urbanist" w:eastAsia="Urbanist" w:hAnsi="Urbanist"/>
+                <w:sz w:val="18"/>
+                <w:szCs w:val="18"/>
+              </w:rPr>
+              <w:t xml:space="preserve">Architectural approach: Strong</w:t>
+            </w:r>
           </w:p>
         </w:tc>
         <w:tc>
@@ -2732,7 +2812,7 @@
                 <w:sz w:val="18"/>
                 <w:szCs w:val="18"/>
               </w:rPr>
-              <w:t xml:space="preserve">According to the publisher's abstract, "Burying the flow of water via subterranean and often distant pinpointed technological mediations (dams, purification plants, pumping stations) facilitates and contributes to masking the social relations through which the metabolic urbanization of water takes place"; in early modernity such structures "were celebrated as glorious icons, carefully designed, ornamented and prominently located in the city", whereas in high modernity they "began to disappear from the cityscape" and "from the urban imagination". Architectural approach: strong.</w:t>
+              <w:t xml:space="preserve">According to the publisher's abstract, "Burying the flow of water via subterranean and often distant pinpointed technological mediations (dams, purification plants, pumping stations) facilitates and contributes to masking the social relations through which the metabolic urbanization of water takes place"; in early modernity such structures "were celebrated as glorious icons, carefully designed, ornamented and prominently located in the city", whereas in high modernity they "began to disappear from the cityscape" and "from the urban imagination".</w:t>
             </w:r>
           </w:p>
         </w:tc>
@@ -2757,6 +2837,14 @@
               <w:keepLines w:val="false"/>
               <w:spacing w:after="0" w:line="240"/>
             </w:pPr>
+            <w:r>
+              <w:rPr>
+                <w:rFonts w:ascii="Urbanist" w:cs="Urbanist" w:eastAsia="Urbanist" w:hAnsi="Urbanist"/>
+                <w:sz w:val="18"/>
+                <w:szCs w:val="18"/>
+              </w:rPr>
+              <w:t xml:space="preserve">Architectural approach: Strong</w:t>
+            </w:r>
           </w:p>
         </w:tc>
         <w:tc>
@@ -2886,7 +2974,7 @@
                 <w:sz w:val="18"/>
                 <w:szCs w:val="18"/>
               </w:rPr>
-              <w:t xml:space="preserve">According to the abstract of this master's thesis, the "'Modern Water' understanding of today sees water as a service to be provided and makes it invisible to users", causing "lack of awareness, responsibility and loss of a socio-cultural value". The thesis concerns Istanbul, the city supplied by the Melen Water Supply Project. Architectural approach: strong.</w:t>
+              <w:t xml:space="preserve">According to the abstract of this master's thesis, the "'Modern Water' understanding of today sees water as a service to be provided and makes it invisible to users", causing "lack of awareness, responsibility and loss of a socio-cultural value". The thesis concerns Istanbul, the city supplied by the Melen Water Supply Project.</w:t>
             </w:r>
           </w:p>
         </w:tc>
@@ -2911,6 +2999,14 @@
               <w:keepLines w:val="false"/>
               <w:spacing w:after="0" w:line="240"/>
             </w:pPr>
+            <w:r>
+              <w:rPr>
+                <w:rFonts w:ascii="Urbanist" w:cs="Urbanist" w:eastAsia="Urbanist" w:hAnsi="Urbanist"/>
+                <w:sz w:val="18"/>
+                <w:szCs w:val="18"/>
+              </w:rPr>
+              <w:t xml:space="preserve">Architectural approach: Strong</w:t>
+            </w:r>
           </w:p>
         </w:tc>
         <w:tc>
@@ -3058,7 +3154,7 @@
                 <w:sz w:val="18"/>
                 <w:szCs w:val="18"/>
               </w:rPr>
-              <w:t xml:space="preserve">According to the publisher's abstract, the essay maps out "visual studies as an emergent academic formation", questions "the overturning of 'scopic regimes'" and concludes with an exercise the author calls "showing seeing". The source can frame the positioning of this research in relation to visual culture. Architectural approach: weak.</w:t>
+              <w:t xml:space="preserve">According to the publisher's abstract, the essay maps out "visual studies as an emergent academic formation", questions "the overturning of 'scopic regimes'" and concludes with an exercise the author calls "showing seeing". The source can frame the positioning of this research in relation to visual culture.</w:t>
             </w:r>
           </w:p>
         </w:tc>
@@ -3083,6 +3179,14 @@
               <w:keepLines w:val="false"/>
               <w:spacing w:after="0" w:line="240"/>
             </w:pPr>
+            <w:r>
+              <w:rPr>
+                <w:rFonts w:ascii="Urbanist" w:cs="Urbanist" w:eastAsia="Urbanist" w:hAnsi="Urbanist"/>
+                <w:sz w:val="18"/>
+                <w:szCs w:val="18"/>
+              </w:rPr>
+              <w:t xml:space="preserve">Architectural approach: Weak</w:t>
+            </w:r>
           </w:p>
         </w:tc>
         <w:tc>
@@ -3212,7 +3316,7 @@
                 <w:sz w:val="18"/>
                 <w:szCs w:val="18"/>
               </w:rPr>
-              <w:t xml:space="preserve">The essay, open access in Places Journal, discusses tours, audio guides and artistic projects that aim to "make visible the invisible", including a project that highlights what remains "at the periphery of visibility," what seems "illegible or even un-mappable". The registers of publicness and legibility can be discussed through these practices of infrastructural tourism. Architectural approach: strong.</w:t>
+              <w:t xml:space="preserve">The essay, open access in Places Journal, discusses tours, audio guides and artistic projects that aim to "make visible the invisible", including a project that highlights what remains "at the periphery of visibility," what seems "illegible or even un-mappable". The registers of publicness and legibility can be discussed through these practices of infrastructural tourism.</w:t>
             </w:r>
           </w:p>
         </w:tc>
@@ -3237,6 +3341,14 @@
               <w:keepLines w:val="false"/>
               <w:spacing w:after="0" w:line="240"/>
             </w:pPr>
+            <w:r>
+              <w:rPr>
+                <w:rFonts w:ascii="Urbanist" w:cs="Urbanist" w:eastAsia="Urbanist" w:hAnsi="Urbanist"/>
+                <w:sz w:val="18"/>
+                <w:szCs w:val="18"/>
+              </w:rPr>
+              <w:t xml:space="preserve">Architectural approach: Strong</w:t>
+            </w:r>
           </w:p>
         </w:tc>
         <w:tc>
@@ -3366,7 +3478,7 @@
                 <w:sz w:val="18"/>
                 <w:szCs w:val="18"/>
               </w:rPr>
-              <w:t xml:space="preserve">The first chapter, "A Dam Site More Modern: Developing TVA Monumentality in Visual Culture" (pp. 24-56), situates the infrastructure of the Tennessee Valley Authority within visual culture. The register of representation can be located in this material. Architectural approach: strong.</w:t>
+              <w:t xml:space="preserve">The first chapter, "A Dam Site More Modern: Developing TVA Monumentality in Visual Culture" (pp. 24-56), situates the infrastructure of the Tennessee Valley Authority within visual culture. The register of representation can be located in this material.</w:t>
             </w:r>
           </w:p>
         </w:tc>
@@ -3391,6 +3503,14 @@
               <w:keepLines w:val="false"/>
               <w:spacing w:after="0" w:line="240"/>
             </w:pPr>
+            <w:r>
+              <w:rPr>
+                <w:rFonts w:ascii="Urbanist" w:cs="Urbanist" w:eastAsia="Urbanist" w:hAnsi="Urbanist"/>
+                <w:sz w:val="18"/>
+                <w:szCs w:val="18"/>
+              </w:rPr>
+              <w:t xml:space="preserve">Architectural approach: Strong</w:t>
+            </w:r>
           </w:p>
         </w:tc>
         <w:tc>
@@ -3538,7 +3658,7 @@
                 <w:sz w:val="18"/>
                 <w:szCs w:val="18"/>
               </w:rPr>
-              <w:t xml:space="preserve">According to the publisher's abstract, the article explores "the politics of infrastructure in Jakarta through the lens of in/visibility", notes that infrastructure studies has tended to categorise infrastructure "as either hyper-visible by design, or invisible until breakdown", and argues that "spectacular, visible infrastructures generate public and political attention, while below ground, hidden and invisible infrastructures are overlooked". The register of publicness can be discussed through this "politics of visibility". Architectural approach: weak.</w:t>
+              <w:t xml:space="preserve">According to the publisher's abstract, the article explores "the politics of infrastructure in Jakarta through the lens of in/visibility", notes that infrastructure studies has tended to categorise infrastructure "as either hyper-visible by design, or invisible until breakdown", and argues that "spectacular, visible infrastructures generate public and political attention, while below ground, hidden and invisible infrastructures are overlooked". The register of publicness can be discussed through this "politics of visibility".</w:t>
             </w:r>
           </w:p>
         </w:tc>
@@ -3563,6 +3683,14 @@
               <w:keepLines w:val="false"/>
               <w:spacing w:after="0" w:line="240"/>
             </w:pPr>
+            <w:r>
+              <w:rPr>
+                <w:rFonts w:ascii="Urbanist" w:cs="Urbanist" w:eastAsia="Urbanist" w:hAnsi="Urbanist"/>
+                <w:sz w:val="18"/>
+                <w:szCs w:val="18"/>
+              </w:rPr>
+              <w:t xml:space="preserve">Architectural approach: Weak</w:t>
+            </w:r>
           </w:p>
         </w:tc>
         <w:tc>
@@ -3692,7 +3820,7 @@
                 <w:sz w:val="18"/>
                 <w:szCs w:val="18"/>
               </w:rPr>
-              <w:t xml:space="preserve">According to the chapter abstract, Kambic examines "three responses to inaccessible water infrastructure" in Los Angeles, namely "accepting the situation, incremental infrastructure, and the Cyborg City", under the title of urban water visibility, legibility and access. The registers of legibility and access can be read in these responses. Architectural approach: weak.</w:t>
+              <w:t xml:space="preserve">According to the chapter abstract, Kambic examines "three responses to inaccessible water infrastructure" in Los Angeles, namely "accepting the situation, incremental infrastructure, and the Cyborg City", under the title of urban water visibility, legibility and access. The registers of legibility and access can be read in these responses.</w:t>
             </w:r>
           </w:p>
         </w:tc>
@@ -3717,6 +3845,14 @@
               <w:keepLines w:val="false"/>
               <w:spacing w:after="0" w:line="240"/>
             </w:pPr>
+            <w:r>
+              <w:rPr>
+                <w:rFonts w:ascii="Urbanist" w:cs="Urbanist" w:eastAsia="Urbanist" w:hAnsi="Urbanist"/>
+                <w:sz w:val="18"/>
+                <w:szCs w:val="18"/>
+              </w:rPr>
+              <w:t xml:space="preserve">Architectural approach: Weak</w:t>
+            </w:r>
           </w:p>
         </w:tc>
         <w:tc>
@@ -3846,7 +3982,7 @@
                 <w:sz w:val="18"/>
                 <w:szCs w:val="18"/>
               </w:rPr>
-              <w:t xml:space="preserve">The title presents the Aqueduct of Valens as "Byzantine heritage depicted", and the abstract states that the aqueduct "maintained its critical operation for supplying water and, at the same time protected its urban presence in the urban topography". The register of representation can be located in the depictions of a water structure of Istanbul. Architectural approach: strong.</w:t>
+              <w:t xml:space="preserve">The title presents the Aqueduct of Valens as "Byzantine heritage depicted", and the abstract states that the aqueduct "maintained its critical operation for supplying water and, at the same time protected its urban presence in the urban topography". The register of representation can be located in the depictions of a water structure of Istanbul.</w:t>
             </w:r>
           </w:p>
         </w:tc>
@@ -3871,6 +4007,14 @@
               <w:keepLines w:val="false"/>
               <w:spacing w:after="0" w:line="240"/>
             </w:pPr>
+            <w:r>
+              <w:rPr>
+                <w:rFonts w:ascii="Urbanist" w:cs="Urbanist" w:eastAsia="Urbanist" w:hAnsi="Urbanist"/>
+                <w:sz w:val="18"/>
+                <w:szCs w:val="18"/>
+              </w:rPr>
+              <w:t xml:space="preserve">Architectural approach: Strong</w:t>
+            </w:r>
           </w:p>
         </w:tc>
         <w:tc>
@@ -3924,6 +4068,7 @@
     <w:p>
       <w:pPr>
         <w:spacing w:after="120" w:line="264"/>
+        <w:jc w:val="left"/>
       </w:pPr>
     </w:p>
     <w:p>
@@ -3955,9 +4100,10 @@
         </w:tblBorders>
       </w:tblPr>
       <w:tblGrid>
-        <w:gridCol w:w="3250"/>
-        <w:gridCol w:w="4000"/>
-        <w:gridCol w:w="1820"/>
+        <w:gridCol w:w="2750"/>
+        <w:gridCol w:w="3000"/>
+        <w:gridCol w:w="1900"/>
+        <w:gridCol w:w="1420"/>
       </w:tblGrid>
       <w:tr>
         <w:trPr>
@@ -3965,7 +4111,7 @@
         </w:trPr>
         <w:tc>
           <w:tcPr>
-            <w:tcW w:type="dxa" w:w="3250"/>
+            <w:tcW w:type="dxa" w:w="2750"/>
             <w:tcBorders>
               <w:top w:val="single" w:color="000000" w:sz="4"/>
               <w:left w:val="single" w:color="000000" w:sz="4"/>
@@ -3992,13 +4138,13 @@
                 <w:sz w:val="18"/>
                 <w:szCs w:val="18"/>
               </w:rPr>
-              <w:t xml:space="preserve">Source (APA 7)</w:t>
-            </w:r>
-          </w:p>
-        </w:tc>
-        <w:tc>
-          <w:tcPr>
-            <w:tcW w:type="dxa" w:w="4000"/>
+              <w:t xml:space="preserve">Source</w:t>
+            </w:r>
+          </w:p>
+        </w:tc>
+        <w:tc>
+          <w:tcPr>
+            <w:tcW w:type="dxa" w:w="3000"/>
             <w:tcBorders>
               <w:top w:val="single" w:color="000000" w:sz="4"/>
               <w:left w:val="single" w:color="000000" w:sz="4"/>
@@ -4031,7 +4177,40 @@
         </w:tc>
         <w:tc>
           <w:tcPr>
-            <w:tcW w:type="dxa" w:w="1820"/>
+            <w:tcW w:type="dxa" w:w="1900"/>
+            <w:tcBorders>
+              <w:top w:val="single" w:color="000000" w:sz="4"/>
+              <w:left w:val="single" w:color="000000" w:sz="4"/>
+              <w:bottom w:val="single" w:color="000000" w:sz="4"/>
+              <w:right w:val="single" w:color="000000" w:sz="4"/>
+            </w:tcBorders>
+            <w:tcMar>
+              <w:top w:type="dxa" w:w="60"/>
+              <w:left w:type="dxa" w:w="100"/>
+              <w:bottom w:type="dxa" w:w="60"/>
+              <w:right w:type="dxa" w:w="100"/>
+            </w:tcMar>
+          </w:tcPr>
+          <w:p>
+            <w:pPr>
+              <w:keepLines w:val="false"/>
+              <w:spacing w:after="0" w:line="240"/>
+            </w:pPr>
+            <w:r>
+              <w:rPr>
+                <w:rFonts w:ascii="Urbanist" w:cs="Urbanist" w:eastAsia="Urbanist" w:hAnsi="Urbanist"/>
+                <w:b/>
+                <w:bCs/>
+                <w:sz w:val="18"/>
+                <w:szCs w:val="18"/>
+              </w:rPr>
+              <w:t xml:space="preserve">Positioning</w:t>
+            </w:r>
+          </w:p>
+        </w:tc>
+        <w:tc>
+          <w:tcPr>
+            <w:tcW w:type="dxa" w:w="1420"/>
             <w:tcBorders>
               <w:top w:val="single" w:color="000000" w:sz="4"/>
               <w:left w:val="single" w:color="000000" w:sz="4"/>
@@ -4069,7 +4248,7 @@
         </w:trPr>
         <w:tc>
           <w:tcPr>
-            <w:tcW w:type="dxa" w:w="3250"/>
+            <w:tcW w:type="dxa" w:w="2750"/>
             <w:tcBorders>
               <w:top w:val="single" w:color="000000" w:sz="4"/>
               <w:left w:val="single" w:color="000000" w:sz="4"/>
@@ -4118,38 +4297,69 @@
         </w:tc>
         <w:tc>
           <w:tcPr>
-            <w:tcW w:type="dxa" w:w="4000"/>
-            <w:tcBorders>
-              <w:top w:val="single" w:color="000000" w:sz="4"/>
-              <w:left w:val="single" w:color="000000" w:sz="4"/>
-              <w:bottom w:val="single" w:color="000000" w:sz="4"/>
-              <w:right w:val="single" w:color="000000" w:sz="4"/>
-            </w:tcBorders>
-            <w:tcMar>
-              <w:top w:type="dxa" w:w="60"/>
-              <w:left w:type="dxa" w:w="100"/>
-              <w:bottom w:type="dxa" w:w="60"/>
-              <w:right w:type="dxa" w:w="100"/>
-            </w:tcMar>
-          </w:tcPr>
-          <w:p>
-            <w:pPr>
-              <w:keepLines w:val="false"/>
-              <w:spacing w:after="0" w:line="240"/>
-            </w:pPr>
-            <w:r>
-              <w:rPr>
-                <w:rFonts w:ascii="Urbanist" w:cs="Urbanist" w:eastAsia="Urbanist" w:hAnsi="Urbanist"/>
-                <w:sz w:val="18"/>
-                <w:szCs w:val="18"/>
-              </w:rPr>
-              <w:t xml:space="preserve">According to the publisher's description, the architectural projects of the book become "a medium to synthesize different forms and scales of knowledge on technological externalities", among them water shortage, and revisit "devices of wonder that assemble publics around representations of the Earth". The registers of representation and publicness can be discussed through this design research. Architectural approach: strong.</w:t>
-            </w:r>
-          </w:p>
-        </w:tc>
-        <w:tc>
-          <w:tcPr>
-            <w:tcW w:type="dxa" w:w="1820"/>
+            <w:tcW w:type="dxa" w:w="3000"/>
+            <w:tcBorders>
+              <w:top w:val="single" w:color="000000" w:sz="4"/>
+              <w:left w:val="single" w:color="000000" w:sz="4"/>
+              <w:bottom w:val="single" w:color="000000" w:sz="4"/>
+              <w:right w:val="single" w:color="000000" w:sz="4"/>
+            </w:tcBorders>
+            <w:tcMar>
+              <w:top w:type="dxa" w:w="60"/>
+              <w:left w:type="dxa" w:w="100"/>
+              <w:bottom w:type="dxa" w:w="60"/>
+              <w:right w:type="dxa" w:w="100"/>
+            </w:tcMar>
+          </w:tcPr>
+          <w:p>
+            <w:pPr>
+              <w:keepLines w:val="false"/>
+              <w:spacing w:after="0" w:line="240"/>
+            </w:pPr>
+            <w:r>
+              <w:rPr>
+                <w:rFonts w:ascii="Urbanist" w:cs="Urbanist" w:eastAsia="Urbanist" w:hAnsi="Urbanist"/>
+                <w:sz w:val="18"/>
+                <w:szCs w:val="18"/>
+              </w:rPr>
+              <w:t xml:space="preserve">According to the publisher's description, the architectural projects of the book become "a medium to synthesize different forms and scales of knowledge on technological externalities", among them water shortage, and revisit "devices of wonder that assemble publics around representations of the Earth". The registers of representation and publicness can be discussed through this design research.</w:t>
+            </w:r>
+          </w:p>
+        </w:tc>
+        <w:tc>
+          <w:tcPr>
+            <w:tcW w:type="dxa" w:w="1900"/>
+            <w:tcBorders>
+              <w:top w:val="single" w:color="000000" w:sz="4"/>
+              <w:left w:val="single" w:color="000000" w:sz="4"/>
+              <w:bottom w:val="single" w:color="000000" w:sz="4"/>
+              <w:right w:val="single" w:color="000000" w:sz="4"/>
+            </w:tcBorders>
+            <w:tcMar>
+              <w:top w:type="dxa" w:w="60"/>
+              <w:left w:type="dxa" w:w="100"/>
+              <w:bottom w:type="dxa" w:w="60"/>
+              <w:right w:type="dxa" w:w="100"/>
+            </w:tcMar>
+          </w:tcPr>
+          <w:p>
+            <w:pPr>
+              <w:keepLines w:val="false"/>
+              <w:spacing w:after="0" w:line="240"/>
+            </w:pPr>
+            <w:r>
+              <w:rPr>
+                <w:rFonts w:ascii="Urbanist" w:cs="Urbanist" w:eastAsia="Urbanist" w:hAnsi="Urbanist"/>
+                <w:sz w:val="18"/>
+                <w:szCs w:val="18"/>
+              </w:rPr>
+              <w:t xml:space="preserve">Architectural approach: Strong</w:t>
+            </w:r>
+          </w:p>
+        </w:tc>
+        <w:tc>
+          <w:tcPr>
+            <w:tcW w:type="dxa" w:w="1420"/>
             <w:tcBorders>
               <w:top w:val="single" w:color="000000" w:sz="4"/>
               <w:left w:val="single" w:color="000000" w:sz="4"/>
@@ -4200,7 +4410,7 @@
         </w:trPr>
         <w:tc>
           <w:tcPr>
-            <w:tcW w:type="dxa" w:w="3250"/>
+            <w:tcW w:type="dxa" w:w="2750"/>
             <w:tcBorders>
               <w:top w:val="single" w:color="000000" w:sz="4"/>
               <w:left w:val="single" w:color="000000" w:sz="4"/>
@@ -4249,38 +4459,69 @@
         </w:tc>
         <w:tc>
           <w:tcPr>
-            <w:tcW w:type="dxa" w:w="4000"/>
-            <w:tcBorders>
-              <w:top w:val="single" w:color="000000" w:sz="4"/>
-              <w:left w:val="single" w:color="000000" w:sz="4"/>
-              <w:bottom w:val="single" w:color="000000" w:sz="4"/>
-              <w:right w:val="single" w:color="000000" w:sz="4"/>
-            </w:tcBorders>
-            <w:tcMar>
-              <w:top w:type="dxa" w:w="60"/>
-              <w:left w:type="dxa" w:w="100"/>
-              <w:bottom w:type="dxa" w:w="60"/>
-              <w:right w:type="dxa" w:w="100"/>
-            </w:tcMar>
-          </w:tcPr>
-          <w:p>
-            <w:pPr>
-              <w:keepLines w:val="false"/>
-              <w:spacing w:after="0" w:line="240"/>
-            </w:pPr>
-            <w:r>
-              <w:rPr>
-                <w:rFonts w:ascii="Urbanist" w:cs="Urbanist" w:eastAsia="Urbanist" w:hAnsi="Urbanist"/>
-                <w:sz w:val="18"/>
-                <w:szCs w:val="18"/>
-              </w:rPr>
-              <w:t xml:space="preserve">The record held for this review is limited to the bibliographic details and a book review; the book addresses the Mississippi floods through "designing a shifting landscape", as its title states. Its relation to the register of representation remains to be established by reading. Architectural approach: strong.</w:t>
-            </w:r>
-          </w:p>
-        </w:tc>
-        <w:tc>
-          <w:tcPr>
-            <w:tcW w:type="dxa" w:w="1820"/>
+            <w:tcW w:type="dxa" w:w="3000"/>
+            <w:tcBorders>
+              <w:top w:val="single" w:color="000000" w:sz="4"/>
+              <w:left w:val="single" w:color="000000" w:sz="4"/>
+              <w:bottom w:val="single" w:color="000000" w:sz="4"/>
+              <w:right w:val="single" w:color="000000" w:sz="4"/>
+            </w:tcBorders>
+            <w:tcMar>
+              <w:top w:type="dxa" w:w="60"/>
+              <w:left w:type="dxa" w:w="100"/>
+              <w:bottom w:type="dxa" w:w="60"/>
+              <w:right w:type="dxa" w:w="100"/>
+            </w:tcMar>
+          </w:tcPr>
+          <w:p>
+            <w:pPr>
+              <w:keepLines w:val="false"/>
+              <w:spacing w:after="0" w:line="240"/>
+            </w:pPr>
+            <w:r>
+              <w:rPr>
+                <w:rFonts w:ascii="Urbanist" w:cs="Urbanist" w:eastAsia="Urbanist" w:hAnsi="Urbanist"/>
+                <w:sz w:val="18"/>
+                <w:szCs w:val="18"/>
+              </w:rPr>
+              <w:t xml:space="preserve">The record held for this review is limited to the bibliographic details and a book review; the book addresses the Mississippi floods through "designing a shifting landscape", as its title states. Its relation to the register of representation remains to be established by reading.</w:t>
+            </w:r>
+          </w:p>
+        </w:tc>
+        <w:tc>
+          <w:tcPr>
+            <w:tcW w:type="dxa" w:w="1900"/>
+            <w:tcBorders>
+              <w:top w:val="single" w:color="000000" w:sz="4"/>
+              <w:left w:val="single" w:color="000000" w:sz="4"/>
+              <w:bottom w:val="single" w:color="000000" w:sz="4"/>
+              <w:right w:val="single" w:color="000000" w:sz="4"/>
+            </w:tcBorders>
+            <w:tcMar>
+              <w:top w:type="dxa" w:w="60"/>
+              <w:left w:type="dxa" w:w="100"/>
+              <w:bottom w:type="dxa" w:w="60"/>
+              <w:right w:type="dxa" w:w="100"/>
+            </w:tcMar>
+          </w:tcPr>
+          <w:p>
+            <w:pPr>
+              <w:keepLines w:val="false"/>
+              <w:spacing w:after="0" w:line="240"/>
+            </w:pPr>
+            <w:r>
+              <w:rPr>
+                <w:rFonts w:ascii="Urbanist" w:cs="Urbanist" w:eastAsia="Urbanist" w:hAnsi="Urbanist"/>
+                <w:sz w:val="18"/>
+                <w:szCs w:val="18"/>
+              </w:rPr>
+              <w:t xml:space="preserve">Architectural approach: Strong</w:t>
+            </w:r>
+          </w:p>
+        </w:tc>
+        <w:tc>
+          <w:tcPr>
+            <w:tcW w:type="dxa" w:w="1420"/>
             <w:tcBorders>
               <w:top w:val="single" w:color="000000" w:sz="4"/>
               <w:left w:val="single" w:color="000000" w:sz="4"/>
@@ -4331,7 +4572,7 @@
         </w:trPr>
         <w:tc>
           <w:tcPr>
-            <w:tcW w:type="dxa" w:w="3250"/>
+            <w:tcW w:type="dxa" w:w="2750"/>
             <w:tcBorders>
               <w:top w:val="single" w:color="000000" w:sz="4"/>
               <w:left w:val="single" w:color="000000" w:sz="4"/>
@@ -4398,38 +4639,69 @@
         </w:tc>
         <w:tc>
           <w:tcPr>
-            <w:tcW w:type="dxa" w:w="4000"/>
-            <w:tcBorders>
-              <w:top w:val="single" w:color="000000" w:sz="4"/>
-              <w:left w:val="single" w:color="000000" w:sz="4"/>
-              <w:bottom w:val="single" w:color="000000" w:sz="4"/>
-              <w:right w:val="single" w:color="000000" w:sz="4"/>
-            </w:tcBorders>
-            <w:tcMar>
-              <w:top w:type="dxa" w:w="60"/>
-              <w:left w:type="dxa" w:w="100"/>
-              <w:bottom w:type="dxa" w:w="60"/>
-              <w:right w:type="dxa" w:w="100"/>
-            </w:tcMar>
-          </w:tcPr>
-          <w:p>
-            <w:pPr>
-              <w:keepLines w:val="false"/>
-              <w:spacing w:after="0" w:line="240"/>
-            </w:pPr>
-            <w:r>
-              <w:rPr>
-                <w:rFonts w:ascii="Urbanist" w:cs="Urbanist" w:eastAsia="Urbanist" w:hAnsi="Urbanist"/>
-                <w:sz w:val="18"/>
-                <w:szCs w:val="18"/>
-              </w:rPr>
-              <w:t xml:space="preserve">A short text (pp. 35-37) in the Journal of Architectural Education titled "Aqueous Terrain". The record held for this review is limited to the bibliographic details; its relation to the question of visibility remains to be established by reading. Architectural approach: strong.</w:t>
-            </w:r>
-          </w:p>
-        </w:tc>
-        <w:tc>
-          <w:tcPr>
-            <w:tcW w:type="dxa" w:w="1820"/>
+            <w:tcW w:type="dxa" w:w="3000"/>
+            <w:tcBorders>
+              <w:top w:val="single" w:color="000000" w:sz="4"/>
+              <w:left w:val="single" w:color="000000" w:sz="4"/>
+              <w:bottom w:val="single" w:color="000000" w:sz="4"/>
+              <w:right w:val="single" w:color="000000" w:sz="4"/>
+            </w:tcBorders>
+            <w:tcMar>
+              <w:top w:type="dxa" w:w="60"/>
+              <w:left w:type="dxa" w:w="100"/>
+              <w:bottom w:type="dxa" w:w="60"/>
+              <w:right w:type="dxa" w:w="100"/>
+            </w:tcMar>
+          </w:tcPr>
+          <w:p>
+            <w:pPr>
+              <w:keepLines w:val="false"/>
+              <w:spacing w:after="0" w:line="240"/>
+            </w:pPr>
+            <w:r>
+              <w:rPr>
+                <w:rFonts w:ascii="Urbanist" w:cs="Urbanist" w:eastAsia="Urbanist" w:hAnsi="Urbanist"/>
+                <w:sz w:val="18"/>
+                <w:szCs w:val="18"/>
+              </w:rPr>
+              <w:t xml:space="preserve">A short text (pp. 35-37) in the Journal of Architectural Education titled "Aqueous Terrain". The record held for this review is limited to the bibliographic details; its relation to the question of visibility remains to be established by reading.</w:t>
+            </w:r>
+          </w:p>
+        </w:tc>
+        <w:tc>
+          <w:tcPr>
+            <w:tcW w:type="dxa" w:w="1900"/>
+            <w:tcBorders>
+              <w:top w:val="single" w:color="000000" w:sz="4"/>
+              <w:left w:val="single" w:color="000000" w:sz="4"/>
+              <w:bottom w:val="single" w:color="000000" w:sz="4"/>
+              <w:right w:val="single" w:color="000000" w:sz="4"/>
+            </w:tcBorders>
+            <w:tcMar>
+              <w:top w:type="dxa" w:w="60"/>
+              <w:left w:type="dxa" w:w="100"/>
+              <w:bottom w:type="dxa" w:w="60"/>
+              <w:right w:type="dxa" w:w="100"/>
+            </w:tcMar>
+          </w:tcPr>
+          <w:p>
+            <w:pPr>
+              <w:keepLines w:val="false"/>
+              <w:spacing w:after="0" w:line="240"/>
+            </w:pPr>
+            <w:r>
+              <w:rPr>
+                <w:rFonts w:ascii="Urbanist" w:cs="Urbanist" w:eastAsia="Urbanist" w:hAnsi="Urbanist"/>
+                <w:sz w:val="18"/>
+                <w:szCs w:val="18"/>
+              </w:rPr>
+              <w:t xml:space="preserve">Architectural approach: Strong</w:t>
+            </w:r>
+          </w:p>
+        </w:tc>
+        <w:tc>
+          <w:tcPr>
+            <w:tcW w:type="dxa" w:w="1420"/>
             <w:tcBorders>
               <w:top w:val="single" w:color="000000" w:sz="4"/>
               <w:left w:val="single" w:color="000000" w:sz="4"/>
@@ -4480,7 +4752,7 @@
         </w:trPr>
         <w:tc>
           <w:tcPr>
-            <w:tcW w:type="dxa" w:w="3250"/>
+            <w:tcW w:type="dxa" w:w="2750"/>
             <w:tcBorders>
               <w:top w:val="single" w:color="000000" w:sz="4"/>
               <w:left w:val="single" w:color="000000" w:sz="4"/>
@@ -4529,38 +4801,69 @@
         </w:tc>
         <w:tc>
           <w:tcPr>
-            <w:tcW w:type="dxa" w:w="4000"/>
-            <w:tcBorders>
-              <w:top w:val="single" w:color="000000" w:sz="4"/>
-              <w:left w:val="single" w:color="000000" w:sz="4"/>
-              <w:bottom w:val="single" w:color="000000" w:sz="4"/>
-              <w:right w:val="single" w:color="000000" w:sz="4"/>
-            </w:tcBorders>
-            <w:tcMar>
-              <w:top w:type="dxa" w:w="60"/>
-              <w:left w:type="dxa" w:w="100"/>
-              <w:bottom w:type="dxa" w:w="60"/>
-              <w:right w:type="dxa" w:w="100"/>
-            </w:tcMar>
-          </w:tcPr>
-          <w:p>
-            <w:pPr>
-              <w:keepLines w:val="false"/>
-              <w:spacing w:after="0" w:line="240"/>
-            </w:pPr>
-            <w:r>
-              <w:rPr>
-                <w:rFonts w:ascii="Urbanist" w:cs="Urbanist" w:eastAsia="Urbanist" w:hAnsi="Urbanist"/>
-                <w:sz w:val="18"/>
-                <w:szCs w:val="18"/>
-              </w:rPr>
-              <w:t xml:space="preserve">The review of the book in Places Journal describes Los Angeles as depending "upon vast infrastructural systems that are breathtakingly complex, yet vulnerable to disruption, even disaster". The book is an edited volume on the networked ecologies of the city; its chapters remain to be read for the question of visibility. Architectural approach: strong.</w:t>
-            </w:r>
-          </w:p>
-        </w:tc>
-        <w:tc>
-          <w:tcPr>
-            <w:tcW w:type="dxa" w:w="1820"/>
+            <w:tcW w:type="dxa" w:w="3000"/>
+            <w:tcBorders>
+              <w:top w:val="single" w:color="000000" w:sz="4"/>
+              <w:left w:val="single" w:color="000000" w:sz="4"/>
+              <w:bottom w:val="single" w:color="000000" w:sz="4"/>
+              <w:right w:val="single" w:color="000000" w:sz="4"/>
+            </w:tcBorders>
+            <w:tcMar>
+              <w:top w:type="dxa" w:w="60"/>
+              <w:left w:type="dxa" w:w="100"/>
+              <w:bottom w:type="dxa" w:w="60"/>
+              <w:right w:type="dxa" w:w="100"/>
+            </w:tcMar>
+          </w:tcPr>
+          <w:p>
+            <w:pPr>
+              <w:keepLines w:val="false"/>
+              <w:spacing w:after="0" w:line="240"/>
+            </w:pPr>
+            <w:r>
+              <w:rPr>
+                <w:rFonts w:ascii="Urbanist" w:cs="Urbanist" w:eastAsia="Urbanist" w:hAnsi="Urbanist"/>
+                <w:sz w:val="18"/>
+                <w:szCs w:val="18"/>
+              </w:rPr>
+              <w:t xml:space="preserve">The review of the book in Places Journal describes Los Angeles as depending "upon vast infrastructural systems that are breathtakingly complex, yet vulnerable to disruption, even disaster". The book is an edited volume on the networked ecologies of the city; its chapters remain to be read for the question of visibility.</w:t>
+            </w:r>
+          </w:p>
+        </w:tc>
+        <w:tc>
+          <w:tcPr>
+            <w:tcW w:type="dxa" w:w="1900"/>
+            <w:tcBorders>
+              <w:top w:val="single" w:color="000000" w:sz="4"/>
+              <w:left w:val="single" w:color="000000" w:sz="4"/>
+              <w:bottom w:val="single" w:color="000000" w:sz="4"/>
+              <w:right w:val="single" w:color="000000" w:sz="4"/>
+            </w:tcBorders>
+            <w:tcMar>
+              <w:top w:type="dxa" w:w="60"/>
+              <w:left w:type="dxa" w:w="100"/>
+              <w:bottom w:type="dxa" w:w="60"/>
+              <w:right w:type="dxa" w:w="100"/>
+            </w:tcMar>
+          </w:tcPr>
+          <w:p>
+            <w:pPr>
+              <w:keepLines w:val="false"/>
+              <w:spacing w:after="0" w:line="240"/>
+            </w:pPr>
+            <w:r>
+              <w:rPr>
+                <w:rFonts w:ascii="Urbanist" w:cs="Urbanist" w:eastAsia="Urbanist" w:hAnsi="Urbanist"/>
+                <w:sz w:val="18"/>
+                <w:szCs w:val="18"/>
+              </w:rPr>
+              <w:t xml:space="preserve">Architectural approach: Strong</w:t>
+            </w:r>
+          </w:p>
+        </w:tc>
+        <w:tc>
+          <w:tcPr>
+            <w:tcW w:type="dxa" w:w="1420"/>
             <w:tcBorders>
               <w:top w:val="single" w:color="000000" w:sz="4"/>
               <w:left w:val="single" w:color="000000" w:sz="4"/>
@@ -4609,6 +4912,7 @@
     <w:p>
       <w:pPr>
         <w:spacing w:after="120" w:line="264"/>
+        <w:jc w:val="left"/>
       </w:pPr>
     </w:p>
     <w:p>
@@ -4640,9 +4944,10 @@
         </w:tblBorders>
       </w:tblPr>
       <w:tblGrid>
-        <w:gridCol w:w="3250"/>
-        <w:gridCol w:w="4000"/>
-        <w:gridCol w:w="1820"/>
+        <w:gridCol w:w="2750"/>
+        <w:gridCol w:w="3000"/>
+        <w:gridCol w:w="1900"/>
+        <w:gridCol w:w="1420"/>
       </w:tblGrid>
       <w:tr>
         <w:trPr>
@@ -4650,7 +4955,7 @@
         </w:trPr>
         <w:tc>
           <w:tcPr>
-            <w:tcW w:type="dxa" w:w="3250"/>
+            <w:tcW w:type="dxa" w:w="2750"/>
             <w:tcBorders>
               <w:top w:val="single" w:color="000000" w:sz="4"/>
               <w:left w:val="single" w:color="000000" w:sz="4"/>
@@ -4677,13 +4982,13 @@
                 <w:sz w:val="18"/>
                 <w:szCs w:val="18"/>
               </w:rPr>
-              <w:t xml:space="preserve">Source (APA 7)</w:t>
-            </w:r>
-          </w:p>
-        </w:tc>
-        <w:tc>
-          <w:tcPr>
-            <w:tcW w:type="dxa" w:w="4000"/>
+              <w:t xml:space="preserve">Source</w:t>
+            </w:r>
+          </w:p>
+        </w:tc>
+        <w:tc>
+          <w:tcPr>
+            <w:tcW w:type="dxa" w:w="3000"/>
             <w:tcBorders>
               <w:top w:val="single" w:color="000000" w:sz="4"/>
               <w:left w:val="single" w:color="000000" w:sz="4"/>
@@ -4716,7 +5021,40 @@
         </w:tc>
         <w:tc>
           <w:tcPr>
-            <w:tcW w:type="dxa" w:w="1820"/>
+            <w:tcW w:type="dxa" w:w="1900"/>
+            <w:tcBorders>
+              <w:top w:val="single" w:color="000000" w:sz="4"/>
+              <w:left w:val="single" w:color="000000" w:sz="4"/>
+              <w:bottom w:val="single" w:color="000000" w:sz="4"/>
+              <w:right w:val="single" w:color="000000" w:sz="4"/>
+            </w:tcBorders>
+            <w:tcMar>
+              <w:top w:type="dxa" w:w="60"/>
+              <w:left w:type="dxa" w:w="100"/>
+              <w:bottom w:type="dxa" w:w="60"/>
+              <w:right w:type="dxa" w:w="100"/>
+            </w:tcMar>
+          </w:tcPr>
+          <w:p>
+            <w:pPr>
+              <w:keepLines w:val="false"/>
+              <w:spacing w:after="0" w:line="240"/>
+            </w:pPr>
+            <w:r>
+              <w:rPr>
+                <w:rFonts w:ascii="Urbanist" w:cs="Urbanist" w:eastAsia="Urbanist" w:hAnsi="Urbanist"/>
+                <w:b/>
+                <w:bCs/>
+                <w:sz w:val="18"/>
+                <w:szCs w:val="18"/>
+              </w:rPr>
+              <w:t xml:space="preserve">Positioning</w:t>
+            </w:r>
+          </w:p>
+        </w:tc>
+        <w:tc>
+          <w:tcPr>
+            <w:tcW w:type="dxa" w:w="1420"/>
             <w:tcBorders>
               <w:top w:val="single" w:color="000000" w:sz="4"/>
               <w:left w:val="single" w:color="000000" w:sz="4"/>
@@ -4754,7 +5092,7 @@
         </w:trPr>
         <w:tc>
           <w:tcPr>
-            <w:tcW w:type="dxa" w:w="3250"/>
+            <w:tcW w:type="dxa" w:w="2750"/>
             <w:tcBorders>
               <w:top w:val="single" w:color="000000" w:sz="4"/>
               <w:left w:val="single" w:color="000000" w:sz="4"/>
@@ -4803,38 +5141,69 @@
         </w:tc>
         <w:tc>
           <w:tcPr>
-            <w:tcW w:type="dxa" w:w="4000"/>
-            <w:tcBorders>
-              <w:top w:val="single" w:color="000000" w:sz="4"/>
-              <w:left w:val="single" w:color="000000" w:sz="4"/>
-              <w:bottom w:val="single" w:color="000000" w:sz="4"/>
-              <w:right w:val="single" w:color="000000" w:sz="4"/>
-            </w:tcBorders>
-            <w:tcMar>
-              <w:top w:type="dxa" w:w="60"/>
-              <w:left w:type="dxa" w:w="100"/>
-              <w:bottom w:type="dxa" w:w="60"/>
-              <w:right w:type="dxa" w:w="100"/>
-            </w:tcMar>
-          </w:tcPr>
-          <w:p>
-            <w:pPr>
-              <w:keepLines w:val="false"/>
-              <w:spacing w:after="0" w:line="240"/>
-            </w:pPr>
-            <w:r>
-              <w:rPr>
-                <w:rFonts w:ascii="Urbanist" w:cs="Urbanist" w:eastAsia="Urbanist" w:hAnsi="Urbanist"/>
-                <w:sz w:val="18"/>
-                <w:szCs w:val="18"/>
-              </w:rPr>
-              <w:t xml:space="preserve">According to the book description, people have created around water "an extensive tangible network of infrastructure, buildings, and urban form", while today "heritage and water are largely two separate disciplinary and professional fields"; the volume links the two through twenty-one chapters. Architectural approach: strong.</w:t>
-            </w:r>
-          </w:p>
-        </w:tc>
-        <w:tc>
-          <w:tcPr>
-            <w:tcW w:type="dxa" w:w="1820"/>
+            <w:tcW w:type="dxa" w:w="3000"/>
+            <w:tcBorders>
+              <w:top w:val="single" w:color="000000" w:sz="4"/>
+              <w:left w:val="single" w:color="000000" w:sz="4"/>
+              <w:bottom w:val="single" w:color="000000" w:sz="4"/>
+              <w:right w:val="single" w:color="000000" w:sz="4"/>
+            </w:tcBorders>
+            <w:tcMar>
+              <w:top w:type="dxa" w:w="60"/>
+              <w:left w:type="dxa" w:w="100"/>
+              <w:bottom w:type="dxa" w:w="60"/>
+              <w:right w:type="dxa" w:w="100"/>
+            </w:tcMar>
+          </w:tcPr>
+          <w:p>
+            <w:pPr>
+              <w:keepLines w:val="false"/>
+              <w:spacing w:after="0" w:line="240"/>
+            </w:pPr>
+            <w:r>
+              <w:rPr>
+                <w:rFonts w:ascii="Urbanist" w:cs="Urbanist" w:eastAsia="Urbanist" w:hAnsi="Urbanist"/>
+                <w:sz w:val="18"/>
+                <w:szCs w:val="18"/>
+              </w:rPr>
+              <w:t xml:space="preserve">According to the book description, people have created around water "an extensive tangible network of infrastructure, buildings, and urban form", while today "heritage and water are largely two separate disciplinary and professional fields"; the volume links the two through twenty-one chapters.</w:t>
+            </w:r>
+          </w:p>
+        </w:tc>
+        <w:tc>
+          <w:tcPr>
+            <w:tcW w:type="dxa" w:w="1900"/>
+            <w:tcBorders>
+              <w:top w:val="single" w:color="000000" w:sz="4"/>
+              <w:left w:val="single" w:color="000000" w:sz="4"/>
+              <w:bottom w:val="single" w:color="000000" w:sz="4"/>
+              <w:right w:val="single" w:color="000000" w:sz="4"/>
+            </w:tcBorders>
+            <w:tcMar>
+              <w:top w:type="dxa" w:w="60"/>
+              <w:left w:type="dxa" w:w="100"/>
+              <w:bottom w:type="dxa" w:w="60"/>
+              <w:right w:type="dxa" w:w="100"/>
+            </w:tcMar>
+          </w:tcPr>
+          <w:p>
+            <w:pPr>
+              <w:keepLines w:val="false"/>
+              <w:spacing w:after="0" w:line="240"/>
+            </w:pPr>
+            <w:r>
+              <w:rPr>
+                <w:rFonts w:ascii="Urbanist" w:cs="Urbanist" w:eastAsia="Urbanist" w:hAnsi="Urbanist"/>
+                <w:sz w:val="18"/>
+                <w:szCs w:val="18"/>
+              </w:rPr>
+              <w:t xml:space="preserve">Architectural approach: Strong</w:t>
+            </w:r>
+          </w:p>
+        </w:tc>
+        <w:tc>
+          <w:tcPr>
+            <w:tcW w:type="dxa" w:w="1420"/>
             <w:tcBorders>
               <w:top w:val="single" w:color="000000" w:sz="4"/>
               <w:left w:val="single" w:color="000000" w:sz="4"/>
@@ -4883,6 +5252,7 @@
     <w:p>
       <w:pPr>
         <w:spacing w:after="120" w:line="264"/>
+        <w:jc w:val="left"/>
       </w:pPr>
     </w:p>
     <w:p>
@@ -4914,9 +5284,10 @@
         </w:tblBorders>
       </w:tblPr>
       <w:tblGrid>
-        <w:gridCol w:w="3250"/>
-        <w:gridCol w:w="4000"/>
-        <w:gridCol w:w="1820"/>
+        <w:gridCol w:w="2750"/>
+        <w:gridCol w:w="3000"/>
+        <w:gridCol w:w="1900"/>
+        <w:gridCol w:w="1420"/>
       </w:tblGrid>
       <w:tr>
         <w:trPr>
@@ -4924,7 +5295,7 @@
         </w:trPr>
         <w:tc>
           <w:tcPr>
-            <w:tcW w:type="dxa" w:w="3250"/>
+            <w:tcW w:type="dxa" w:w="2750"/>
             <w:tcBorders>
               <w:top w:val="single" w:color="000000" w:sz="4"/>
               <w:left w:val="single" w:color="000000" w:sz="4"/>
@@ -4951,13 +5322,13 @@
                 <w:sz w:val="18"/>
                 <w:szCs w:val="18"/>
               </w:rPr>
-              <w:t xml:space="preserve">Source (APA 7)</w:t>
-            </w:r>
-          </w:p>
-        </w:tc>
-        <w:tc>
-          <w:tcPr>
-            <w:tcW w:type="dxa" w:w="4000"/>
+              <w:t xml:space="preserve">Source</w:t>
+            </w:r>
+          </w:p>
+        </w:tc>
+        <w:tc>
+          <w:tcPr>
+            <w:tcW w:type="dxa" w:w="3000"/>
             <w:tcBorders>
               <w:top w:val="single" w:color="000000" w:sz="4"/>
               <w:left w:val="single" w:color="000000" w:sz="4"/>
@@ -4990,7 +5361,40 @@
         </w:tc>
         <w:tc>
           <w:tcPr>
-            <w:tcW w:type="dxa" w:w="1820"/>
+            <w:tcW w:type="dxa" w:w="1900"/>
+            <w:tcBorders>
+              <w:top w:val="single" w:color="000000" w:sz="4"/>
+              <w:left w:val="single" w:color="000000" w:sz="4"/>
+              <w:bottom w:val="single" w:color="000000" w:sz="4"/>
+              <w:right w:val="single" w:color="000000" w:sz="4"/>
+            </w:tcBorders>
+            <w:tcMar>
+              <w:top w:type="dxa" w:w="60"/>
+              <w:left w:type="dxa" w:w="100"/>
+              <w:bottom w:type="dxa" w:w="60"/>
+              <w:right w:type="dxa" w:w="100"/>
+            </w:tcMar>
+          </w:tcPr>
+          <w:p>
+            <w:pPr>
+              <w:keepLines w:val="false"/>
+              <w:spacing w:after="0" w:line="240"/>
+            </w:pPr>
+            <w:r>
+              <w:rPr>
+                <w:rFonts w:ascii="Urbanist" w:cs="Urbanist" w:eastAsia="Urbanist" w:hAnsi="Urbanist"/>
+                <w:b/>
+                <w:bCs/>
+                <w:sz w:val="18"/>
+                <w:szCs w:val="18"/>
+              </w:rPr>
+              <w:t xml:space="preserve">Positioning</w:t>
+            </w:r>
+          </w:p>
+        </w:tc>
+        <w:tc>
+          <w:tcPr>
+            <w:tcW w:type="dxa" w:w="1420"/>
             <w:tcBorders>
               <w:top w:val="single" w:color="000000" w:sz="4"/>
               <w:left w:val="single" w:color="000000" w:sz="4"/>
@@ -5028,7 +5432,7 @@
         </w:trPr>
         <w:tc>
           <w:tcPr>
-            <w:tcW w:type="dxa" w:w="3250"/>
+            <w:tcW w:type="dxa" w:w="2750"/>
             <w:tcBorders>
               <w:top w:val="single" w:color="000000" w:sz="4"/>
               <w:left w:val="single" w:color="000000" w:sz="4"/>
@@ -5077,38 +5481,69 @@
         </w:tc>
         <w:tc>
           <w:tcPr>
-            <w:tcW w:type="dxa" w:w="4000"/>
-            <w:tcBorders>
-              <w:top w:val="single" w:color="000000" w:sz="4"/>
-              <w:left w:val="single" w:color="000000" w:sz="4"/>
-              <w:bottom w:val="single" w:color="000000" w:sz="4"/>
-              <w:right w:val="single" w:color="000000" w:sz="4"/>
-            </w:tcBorders>
-            <w:tcMar>
-              <w:top w:type="dxa" w:w="60"/>
-              <w:left w:type="dxa" w:w="100"/>
-              <w:bottom w:type="dxa" w:w="60"/>
-              <w:right w:type="dxa" w:w="100"/>
-            </w:tcMar>
-          </w:tcPr>
-          <w:p>
-            <w:pPr>
-              <w:keepLines w:val="false"/>
-              <w:spacing w:after="0" w:line="240"/>
-            </w:pPr>
-            <w:r>
-              <w:rPr>
-                <w:rFonts w:ascii="Urbanist" w:cs="Urbanist" w:eastAsia="Urbanist" w:hAnsi="Urbanist"/>
-                <w:sz w:val="18"/>
-                <w:szCs w:val="18"/>
-              </w:rPr>
-              <w:t xml:space="preserve">A course description of the MIT Department of Architecture, cited in this research; it is not a publication, and the texts on its reading list can be consulted as citable sources. Architectural approach: strong.</w:t>
-            </w:r>
-          </w:p>
-        </w:tc>
-        <w:tc>
-          <w:tcPr>
-            <w:tcW w:type="dxa" w:w="1820"/>
+            <w:tcW w:type="dxa" w:w="3000"/>
+            <w:tcBorders>
+              <w:top w:val="single" w:color="000000" w:sz="4"/>
+              <w:left w:val="single" w:color="000000" w:sz="4"/>
+              <w:bottom w:val="single" w:color="000000" w:sz="4"/>
+              <w:right w:val="single" w:color="000000" w:sz="4"/>
+            </w:tcBorders>
+            <w:tcMar>
+              <w:top w:type="dxa" w:w="60"/>
+              <w:left w:type="dxa" w:w="100"/>
+              <w:bottom w:type="dxa" w:w="60"/>
+              <w:right w:type="dxa" w:w="100"/>
+            </w:tcMar>
+          </w:tcPr>
+          <w:p>
+            <w:pPr>
+              <w:keepLines w:val="false"/>
+              <w:spacing w:after="0" w:line="240"/>
+            </w:pPr>
+            <w:r>
+              <w:rPr>
+                <w:rFonts w:ascii="Urbanist" w:cs="Urbanist" w:eastAsia="Urbanist" w:hAnsi="Urbanist"/>
+                <w:sz w:val="18"/>
+                <w:szCs w:val="18"/>
+              </w:rPr>
+              <w:t xml:space="preserve">A course description of the MIT Department of Architecture, cited in this research; it is not a publication, and the texts on its reading list can be consulted as citable sources.</w:t>
+            </w:r>
+          </w:p>
+        </w:tc>
+        <w:tc>
+          <w:tcPr>
+            <w:tcW w:type="dxa" w:w="1900"/>
+            <w:tcBorders>
+              <w:top w:val="single" w:color="000000" w:sz="4"/>
+              <w:left w:val="single" w:color="000000" w:sz="4"/>
+              <w:bottom w:val="single" w:color="000000" w:sz="4"/>
+              <w:right w:val="single" w:color="000000" w:sz="4"/>
+            </w:tcBorders>
+            <w:tcMar>
+              <w:top w:type="dxa" w:w="60"/>
+              <w:left w:type="dxa" w:w="100"/>
+              <w:bottom w:type="dxa" w:w="60"/>
+              <w:right w:type="dxa" w:w="100"/>
+            </w:tcMar>
+          </w:tcPr>
+          <w:p>
+            <w:pPr>
+              <w:keepLines w:val="false"/>
+              <w:spacing w:after="0" w:line="240"/>
+            </w:pPr>
+            <w:r>
+              <w:rPr>
+                <w:rFonts w:ascii="Urbanist" w:cs="Urbanist" w:eastAsia="Urbanist" w:hAnsi="Urbanist"/>
+                <w:sz w:val="18"/>
+                <w:szCs w:val="18"/>
+              </w:rPr>
+              <w:t xml:space="preserve">Architectural approach: Strong</w:t>
+            </w:r>
+          </w:p>
+        </w:tc>
+        <w:tc>
+          <w:tcPr>
+            <w:tcW w:type="dxa" w:w="1420"/>
             <w:tcBorders>
               <w:top w:val="single" w:color="000000" w:sz="4"/>
               <w:left w:val="single" w:color="000000" w:sz="4"/>
@@ -5157,6 +5592,7 @@
     <w:p>
       <w:pPr>
         <w:spacing w:after="120" w:line="264"/>
+        <w:jc w:val="left"/>
       </w:pPr>
     </w:p>
     <w:p>
@@ -5188,9 +5624,10 @@
         </w:tblBorders>
       </w:tblPr>
       <w:tblGrid>
-        <w:gridCol w:w="3250"/>
-        <w:gridCol w:w="4000"/>
-        <w:gridCol w:w="1820"/>
+        <w:gridCol w:w="2750"/>
+        <w:gridCol w:w="3000"/>
+        <w:gridCol w:w="1900"/>
+        <w:gridCol w:w="1420"/>
       </w:tblGrid>
       <w:tr>
         <w:trPr>
@@ -5198,7 +5635,7 @@
         </w:trPr>
         <w:tc>
           <w:tcPr>
-            <w:tcW w:type="dxa" w:w="3250"/>
+            <w:tcW w:type="dxa" w:w="2750"/>
             <w:tcBorders>
               <w:top w:val="single" w:color="000000" w:sz="4"/>
               <w:left w:val="single" w:color="000000" w:sz="4"/>
@@ -5225,13 +5662,13 @@
                 <w:sz w:val="18"/>
                 <w:szCs w:val="18"/>
               </w:rPr>
-              <w:t xml:space="preserve">Source (APA 7)</w:t>
-            </w:r>
-          </w:p>
-        </w:tc>
-        <w:tc>
-          <w:tcPr>
-            <w:tcW w:type="dxa" w:w="4000"/>
+              <w:t xml:space="preserve">Source</w:t>
+            </w:r>
+          </w:p>
+        </w:tc>
+        <w:tc>
+          <w:tcPr>
+            <w:tcW w:type="dxa" w:w="3000"/>
             <w:tcBorders>
               <w:top w:val="single" w:color="000000" w:sz="4"/>
               <w:left w:val="single" w:color="000000" w:sz="4"/>
@@ -5264,7 +5701,40 @@
         </w:tc>
         <w:tc>
           <w:tcPr>
-            <w:tcW w:type="dxa" w:w="1820"/>
+            <w:tcW w:type="dxa" w:w="1900"/>
+            <w:tcBorders>
+              <w:top w:val="single" w:color="000000" w:sz="4"/>
+              <w:left w:val="single" w:color="000000" w:sz="4"/>
+              <w:bottom w:val="single" w:color="000000" w:sz="4"/>
+              <w:right w:val="single" w:color="000000" w:sz="4"/>
+            </w:tcBorders>
+            <w:tcMar>
+              <w:top w:type="dxa" w:w="60"/>
+              <w:left w:type="dxa" w:w="100"/>
+              <w:bottom w:type="dxa" w:w="60"/>
+              <w:right w:type="dxa" w:w="100"/>
+            </w:tcMar>
+          </w:tcPr>
+          <w:p>
+            <w:pPr>
+              <w:keepLines w:val="false"/>
+              <w:spacing w:after="0" w:line="240"/>
+            </w:pPr>
+            <w:r>
+              <w:rPr>
+                <w:rFonts w:ascii="Urbanist" w:cs="Urbanist" w:eastAsia="Urbanist" w:hAnsi="Urbanist"/>
+                <w:b/>
+                <w:bCs/>
+                <w:sz w:val="18"/>
+                <w:szCs w:val="18"/>
+              </w:rPr>
+              <w:t xml:space="preserve">Positioning</w:t>
+            </w:r>
+          </w:p>
+        </w:tc>
+        <w:tc>
+          <w:tcPr>
+            <w:tcW w:type="dxa" w:w="1420"/>
             <w:tcBorders>
               <w:top w:val="single" w:color="000000" w:sz="4"/>
               <w:left w:val="single" w:color="000000" w:sz="4"/>
@@ -5302,7 +5772,7 @@
         </w:trPr>
         <w:tc>
           <w:tcPr>
-            <w:tcW w:type="dxa" w:w="3250"/>
+            <w:tcW w:type="dxa" w:w="2750"/>
             <w:tcBorders>
               <w:top w:val="single" w:color="000000" w:sz="4"/>
               <w:left w:val="single" w:color="000000" w:sz="4"/>
@@ -5351,38 +5821,69 @@
         </w:tc>
         <w:tc>
           <w:tcPr>
-            <w:tcW w:type="dxa" w:w="4000"/>
-            <w:tcBorders>
-              <w:top w:val="single" w:color="000000" w:sz="4"/>
-              <w:left w:val="single" w:color="000000" w:sz="4"/>
-              <w:bottom w:val="single" w:color="000000" w:sz="4"/>
-              <w:right w:val="single" w:color="000000" w:sz="4"/>
-            </w:tcBorders>
-            <w:tcMar>
-              <w:top w:type="dxa" w:w="60"/>
-              <w:left w:type="dxa" w:w="100"/>
-              <w:bottom w:type="dxa" w:w="60"/>
-              <w:right w:type="dxa" w:w="100"/>
-            </w:tcMar>
-          </w:tcPr>
-          <w:p>
-            <w:pPr>
-              <w:keepLines w:val="false"/>
-              <w:spacing w:after="0" w:line="240"/>
-            </w:pPr>
-            <w:r>
-              <w:rPr>
-                <w:rFonts w:ascii="Urbanist" w:cs="Urbanist" w:eastAsia="Urbanist" w:hAnsi="Urbanist"/>
-                <w:sz w:val="18"/>
-                <w:szCs w:val="18"/>
-              </w:rPr>
-              <w:t xml:space="preserve">As the title states, the chapter traces how "a humble French engineering term shaped the modern world". It can serve the definition of the term infrastructure in this research. Architectural approach: weak.</w:t>
-            </w:r>
-          </w:p>
-        </w:tc>
-        <w:tc>
-          <w:tcPr>
-            <w:tcW w:type="dxa" w:w="1820"/>
+            <w:tcW w:type="dxa" w:w="3000"/>
+            <w:tcBorders>
+              <w:top w:val="single" w:color="000000" w:sz="4"/>
+              <w:left w:val="single" w:color="000000" w:sz="4"/>
+              <w:bottom w:val="single" w:color="000000" w:sz="4"/>
+              <w:right w:val="single" w:color="000000" w:sz="4"/>
+            </w:tcBorders>
+            <w:tcMar>
+              <w:top w:type="dxa" w:w="60"/>
+              <w:left w:type="dxa" w:w="100"/>
+              <w:bottom w:type="dxa" w:w="60"/>
+              <w:right w:type="dxa" w:w="100"/>
+            </w:tcMar>
+          </w:tcPr>
+          <w:p>
+            <w:pPr>
+              <w:keepLines w:val="false"/>
+              <w:spacing w:after="0" w:line="240"/>
+            </w:pPr>
+            <w:r>
+              <w:rPr>
+                <w:rFonts w:ascii="Urbanist" w:cs="Urbanist" w:eastAsia="Urbanist" w:hAnsi="Urbanist"/>
+                <w:sz w:val="18"/>
+                <w:szCs w:val="18"/>
+              </w:rPr>
+              <w:t xml:space="preserve">As the title states, the chapter traces how "a humble French engineering term shaped the modern world". It can serve the definition of the term infrastructure in this research.</w:t>
+            </w:r>
+          </w:p>
+        </w:tc>
+        <w:tc>
+          <w:tcPr>
+            <w:tcW w:type="dxa" w:w="1900"/>
+            <w:tcBorders>
+              <w:top w:val="single" w:color="000000" w:sz="4"/>
+              <w:left w:val="single" w:color="000000" w:sz="4"/>
+              <w:bottom w:val="single" w:color="000000" w:sz="4"/>
+              <w:right w:val="single" w:color="000000" w:sz="4"/>
+            </w:tcBorders>
+            <w:tcMar>
+              <w:top w:type="dxa" w:w="60"/>
+              <w:left w:type="dxa" w:w="100"/>
+              <w:bottom w:type="dxa" w:w="60"/>
+              <w:right w:type="dxa" w:w="100"/>
+            </w:tcMar>
+          </w:tcPr>
+          <w:p>
+            <w:pPr>
+              <w:keepLines w:val="false"/>
+              <w:spacing w:after="0" w:line="240"/>
+            </w:pPr>
+            <w:r>
+              <w:rPr>
+                <w:rFonts w:ascii="Urbanist" w:cs="Urbanist" w:eastAsia="Urbanist" w:hAnsi="Urbanist"/>
+                <w:sz w:val="18"/>
+                <w:szCs w:val="18"/>
+              </w:rPr>
+              <w:t xml:space="preserve">Architectural approach: Weak</w:t>
+            </w:r>
+          </w:p>
+        </w:tc>
+        <w:tc>
+          <w:tcPr>
+            <w:tcW w:type="dxa" w:w="1420"/>
             <w:tcBorders>
               <w:top w:val="single" w:color="000000" w:sz="4"/>
               <w:left w:val="single" w:color="000000" w:sz="4"/>
@@ -5433,7 +5934,7 @@
         </w:trPr>
         <w:tc>
           <w:tcPr>
-            <w:tcW w:type="dxa" w:w="3250"/>
+            <w:tcW w:type="dxa" w:w="2750"/>
             <w:tcBorders>
               <w:top w:val="single" w:color="000000" w:sz="4"/>
               <w:left w:val="single" w:color="000000" w:sz="4"/>
@@ -5482,38 +5983,69 @@
         </w:tc>
         <w:tc>
           <w:tcPr>
-            <w:tcW w:type="dxa" w:w="4000"/>
-            <w:tcBorders>
-              <w:top w:val="single" w:color="000000" w:sz="4"/>
-              <w:left w:val="single" w:color="000000" w:sz="4"/>
-              <w:bottom w:val="single" w:color="000000" w:sz="4"/>
-              <w:right w:val="single" w:color="000000" w:sz="4"/>
-            </w:tcBorders>
-            <w:tcMar>
-              <w:top w:type="dxa" w:w="60"/>
-              <w:left w:type="dxa" w:w="100"/>
-              <w:bottom w:type="dxa" w:w="60"/>
-              <w:right w:type="dxa" w:w="100"/>
-            </w:tcMar>
-          </w:tcPr>
-          <w:p>
-            <w:pPr>
-              <w:keepLines w:val="false"/>
-              <w:spacing w:after="0" w:line="240"/>
-            </w:pPr>
-            <w:r>
-              <w:rPr>
-                <w:rFonts w:ascii="Urbanist" w:cs="Urbanist" w:eastAsia="Urbanist" w:hAnsi="Urbanist"/>
-                <w:sz w:val="18"/>
-                <w:szCs w:val="18"/>
-              </w:rPr>
-              <w:t xml:space="preserve">According to the publisher's description, the book analyses "the complex interactions between infrastructure networks and urban spaces", including "infrastructure and the built environment", under the notion of splintering urbanism. Architectural approach: weak.</w:t>
-            </w:r>
-          </w:p>
-        </w:tc>
-        <w:tc>
-          <w:tcPr>
-            <w:tcW w:type="dxa" w:w="1820"/>
+            <w:tcW w:type="dxa" w:w="3000"/>
+            <w:tcBorders>
+              <w:top w:val="single" w:color="000000" w:sz="4"/>
+              <w:left w:val="single" w:color="000000" w:sz="4"/>
+              <w:bottom w:val="single" w:color="000000" w:sz="4"/>
+              <w:right w:val="single" w:color="000000" w:sz="4"/>
+            </w:tcBorders>
+            <w:tcMar>
+              <w:top w:type="dxa" w:w="60"/>
+              <w:left w:type="dxa" w:w="100"/>
+              <w:bottom w:type="dxa" w:w="60"/>
+              <w:right w:type="dxa" w:w="100"/>
+            </w:tcMar>
+          </w:tcPr>
+          <w:p>
+            <w:pPr>
+              <w:keepLines w:val="false"/>
+              <w:spacing w:after="0" w:line="240"/>
+            </w:pPr>
+            <w:r>
+              <w:rPr>
+                <w:rFonts w:ascii="Urbanist" w:cs="Urbanist" w:eastAsia="Urbanist" w:hAnsi="Urbanist"/>
+                <w:sz w:val="18"/>
+                <w:szCs w:val="18"/>
+              </w:rPr>
+              <w:t xml:space="preserve">According to the publisher's description, the book analyses "the complex interactions between infrastructure networks and urban spaces", including "infrastructure and the built environment", under the notion of splintering urbanism.</w:t>
+            </w:r>
+          </w:p>
+        </w:tc>
+        <w:tc>
+          <w:tcPr>
+            <w:tcW w:type="dxa" w:w="1900"/>
+            <w:tcBorders>
+              <w:top w:val="single" w:color="000000" w:sz="4"/>
+              <w:left w:val="single" w:color="000000" w:sz="4"/>
+              <w:bottom w:val="single" w:color="000000" w:sz="4"/>
+              <w:right w:val="single" w:color="000000" w:sz="4"/>
+            </w:tcBorders>
+            <w:tcMar>
+              <w:top w:type="dxa" w:w="60"/>
+              <w:left w:type="dxa" w:w="100"/>
+              <w:bottom w:type="dxa" w:w="60"/>
+              <w:right w:type="dxa" w:w="100"/>
+            </w:tcMar>
+          </w:tcPr>
+          <w:p>
+            <w:pPr>
+              <w:keepLines w:val="false"/>
+              <w:spacing w:after="0" w:line="240"/>
+            </w:pPr>
+            <w:r>
+              <w:rPr>
+                <w:rFonts w:ascii="Urbanist" w:cs="Urbanist" w:eastAsia="Urbanist" w:hAnsi="Urbanist"/>
+                <w:sz w:val="18"/>
+                <w:szCs w:val="18"/>
+              </w:rPr>
+              <w:t xml:space="preserve">Architectural approach: Weak</w:t>
+            </w:r>
+          </w:p>
+        </w:tc>
+        <w:tc>
+          <w:tcPr>
+            <w:tcW w:type="dxa" w:w="1420"/>
             <w:tcBorders>
               <w:top w:val="single" w:color="000000" w:sz="4"/>
               <w:left w:val="single" w:color="000000" w:sz="4"/>
@@ -5562,6 +6094,7 @@
     <w:p>
       <w:pPr>
         <w:spacing w:after="120" w:line="264"/>
+        <w:jc w:val="left"/>
       </w:pPr>
     </w:p>
     <w:p>
@@ -5593,9 +6126,10 @@
         </w:tblBorders>
       </w:tblPr>
       <w:tblGrid>
-        <w:gridCol w:w="3250"/>
-        <w:gridCol w:w="4000"/>
-        <w:gridCol w:w="1820"/>
+        <w:gridCol w:w="2750"/>
+        <w:gridCol w:w="3000"/>
+        <w:gridCol w:w="1900"/>
+        <w:gridCol w:w="1420"/>
       </w:tblGrid>
       <w:tr>
         <w:trPr>
@@ -5603,7 +6137,7 @@
         </w:trPr>
         <w:tc>
           <w:tcPr>
-            <w:tcW w:type="dxa" w:w="3250"/>
+            <w:tcW w:type="dxa" w:w="2750"/>
             <w:tcBorders>
               <w:top w:val="single" w:color="000000" w:sz="4"/>
               <w:left w:val="single" w:color="000000" w:sz="4"/>
@@ -5630,13 +6164,13 @@
                 <w:sz w:val="18"/>
                 <w:szCs w:val="18"/>
               </w:rPr>
-              <w:t xml:space="preserve">Source (APA 7)</w:t>
-            </w:r>
-          </w:p>
-        </w:tc>
-        <w:tc>
-          <w:tcPr>
-            <w:tcW w:type="dxa" w:w="4000"/>
+              <w:t xml:space="preserve">Source</w:t>
+            </w:r>
+          </w:p>
+        </w:tc>
+        <w:tc>
+          <w:tcPr>
+            <w:tcW w:type="dxa" w:w="3000"/>
             <w:tcBorders>
               <w:top w:val="single" w:color="000000" w:sz="4"/>
               <w:left w:val="single" w:color="000000" w:sz="4"/>
@@ -5669,7 +6203,40 @@
         </w:tc>
         <w:tc>
           <w:tcPr>
-            <w:tcW w:type="dxa" w:w="1820"/>
+            <w:tcW w:type="dxa" w:w="1900"/>
+            <w:tcBorders>
+              <w:top w:val="single" w:color="000000" w:sz="4"/>
+              <w:left w:val="single" w:color="000000" w:sz="4"/>
+              <w:bottom w:val="single" w:color="000000" w:sz="4"/>
+              <w:right w:val="single" w:color="000000" w:sz="4"/>
+            </w:tcBorders>
+            <w:tcMar>
+              <w:top w:type="dxa" w:w="60"/>
+              <w:left w:type="dxa" w:w="100"/>
+              <w:bottom w:type="dxa" w:w="60"/>
+              <w:right w:type="dxa" w:w="100"/>
+            </w:tcMar>
+          </w:tcPr>
+          <w:p>
+            <w:pPr>
+              <w:keepLines w:val="false"/>
+              <w:spacing w:after="0" w:line="240"/>
+            </w:pPr>
+            <w:r>
+              <w:rPr>
+                <w:rFonts w:ascii="Urbanist" w:cs="Urbanist" w:eastAsia="Urbanist" w:hAnsi="Urbanist"/>
+                <w:b/>
+                <w:bCs/>
+                <w:sz w:val="18"/>
+                <w:szCs w:val="18"/>
+              </w:rPr>
+              <w:t xml:space="preserve">Positioning</w:t>
+            </w:r>
+          </w:p>
+        </w:tc>
+        <w:tc>
+          <w:tcPr>
+            <w:tcW w:type="dxa" w:w="1420"/>
             <w:tcBorders>
               <w:top w:val="single" w:color="000000" w:sz="4"/>
               <w:left w:val="single" w:color="000000" w:sz="4"/>
@@ -5707,7 +6274,7 @@
         </w:trPr>
         <w:tc>
           <w:tcPr>
-            <w:tcW w:type="dxa" w:w="3250"/>
+            <w:tcW w:type="dxa" w:w="2750"/>
             <w:tcBorders>
               <w:top w:val="single" w:color="000000" w:sz="4"/>
               <w:left w:val="single" w:color="000000" w:sz="4"/>
@@ -5756,38 +6323,69 @@
         </w:tc>
         <w:tc>
           <w:tcPr>
-            <w:tcW w:type="dxa" w:w="4000"/>
-            <w:tcBorders>
-              <w:top w:val="single" w:color="000000" w:sz="4"/>
-              <w:left w:val="single" w:color="000000" w:sz="4"/>
-              <w:bottom w:val="single" w:color="000000" w:sz="4"/>
-              <w:right w:val="single" w:color="000000" w:sz="4"/>
-            </w:tcBorders>
-            <w:tcMar>
-              <w:top w:type="dxa" w:w="60"/>
-              <w:left w:type="dxa" w:w="100"/>
-              <w:bottom w:type="dxa" w:w="60"/>
-              <w:right w:type="dxa" w:w="100"/>
-            </w:tcMar>
-          </w:tcPr>
-          <w:p>
-            <w:pPr>
-              <w:keepLines w:val="false"/>
-              <w:spacing w:after="0" w:line="240"/>
-            </w:pPr>
-            <w:r>
-              <w:rPr>
-                <w:rFonts w:ascii="Urbanist" w:cs="Urbanist" w:eastAsia="Urbanist" w:hAnsi="Urbanist"/>
-                <w:sz w:val="18"/>
-                <w:szCs w:val="18"/>
-              </w:rPr>
-              <w:t xml:space="preserve">According to the abstract of this master's thesis (MIT Department of Architecture, advised by William Porter and Sibel Bozdoğan), the work is about "water infrastructure and its experience as urban and natural space", analysing "water dams and reservoirs that are more than utilitarian structures" through the concept of "ARTIFICIAL NATURE", with sites "from Thrace to Central and Southeastern Anatolia in Turkey from 1920-2000". Architectural approach: strong.</w:t>
-            </w:r>
-          </w:p>
-        </w:tc>
-        <w:tc>
-          <w:tcPr>
-            <w:tcW w:type="dxa" w:w="1820"/>
+            <w:tcW w:type="dxa" w:w="3000"/>
+            <w:tcBorders>
+              <w:top w:val="single" w:color="000000" w:sz="4"/>
+              <w:left w:val="single" w:color="000000" w:sz="4"/>
+              <w:bottom w:val="single" w:color="000000" w:sz="4"/>
+              <w:right w:val="single" w:color="000000" w:sz="4"/>
+            </w:tcBorders>
+            <w:tcMar>
+              <w:top w:type="dxa" w:w="60"/>
+              <w:left w:type="dxa" w:w="100"/>
+              <w:bottom w:type="dxa" w:w="60"/>
+              <w:right w:type="dxa" w:w="100"/>
+            </w:tcMar>
+          </w:tcPr>
+          <w:p>
+            <w:pPr>
+              <w:keepLines w:val="false"/>
+              <w:spacing w:after="0" w:line="240"/>
+            </w:pPr>
+            <w:r>
+              <w:rPr>
+                <w:rFonts w:ascii="Urbanist" w:cs="Urbanist" w:eastAsia="Urbanist" w:hAnsi="Urbanist"/>
+                <w:sz w:val="18"/>
+                <w:szCs w:val="18"/>
+              </w:rPr>
+              <w:t xml:space="preserve">According to the abstract of this master's thesis (MIT Department of Architecture, advised by William Porter and Sibel Bozdoğan), the work is about "water infrastructure and its experience as urban and natural space", analysing "water dams and reservoirs that are more than utilitarian structures" through the concept of "ARTIFICIAL NATURE", with sites "from Thrace to Central and Southeastern Anatolia in Turkey from 1920-2000".</w:t>
+            </w:r>
+          </w:p>
+        </w:tc>
+        <w:tc>
+          <w:tcPr>
+            <w:tcW w:type="dxa" w:w="1900"/>
+            <w:tcBorders>
+              <w:top w:val="single" w:color="000000" w:sz="4"/>
+              <w:left w:val="single" w:color="000000" w:sz="4"/>
+              <w:bottom w:val="single" w:color="000000" w:sz="4"/>
+              <w:right w:val="single" w:color="000000" w:sz="4"/>
+            </w:tcBorders>
+            <w:tcMar>
+              <w:top w:type="dxa" w:w="60"/>
+              <w:left w:type="dxa" w:w="100"/>
+              <w:bottom w:type="dxa" w:w="60"/>
+              <w:right w:type="dxa" w:w="100"/>
+            </w:tcMar>
+          </w:tcPr>
+          <w:p>
+            <w:pPr>
+              <w:keepLines w:val="false"/>
+              <w:spacing w:after="0" w:line="240"/>
+            </w:pPr>
+            <w:r>
+              <w:rPr>
+                <w:rFonts w:ascii="Urbanist" w:cs="Urbanist" w:eastAsia="Urbanist" w:hAnsi="Urbanist"/>
+                <w:sz w:val="18"/>
+                <w:szCs w:val="18"/>
+              </w:rPr>
+              <w:t xml:space="preserve">Architectural approach: Strong</w:t>
+            </w:r>
+          </w:p>
+        </w:tc>
+        <w:tc>
+          <w:tcPr>
+            <w:tcW w:type="dxa" w:w="1420"/>
             <w:tcBorders>
               <w:top w:val="single" w:color="000000" w:sz="4"/>
               <w:left w:val="single" w:color="000000" w:sz="4"/>
@@ -5836,6 +6434,7 @@
     <w:p>
       <w:pPr>
         <w:spacing w:after="120" w:line="264"/>
+        <w:jc w:val="left"/>
       </w:pPr>
     </w:p>
     <w:p>
@@ -5857,6 +6456,7 @@
     <w:p>
       <w:pPr>
         <w:spacing w:after="160" w:line="264"/>
+        <w:jc w:val="both"/>
       </w:pPr>
       <w:r>
         <w:rPr>
@@ -5870,6 +6470,7 @@
     <w:p>
       <w:pPr>
         <w:spacing w:after="160" w:line="264"/>
+        <w:jc w:val="both"/>
       </w:pPr>
       <w:r>
         <w:rPr>
@@ -5883,6 +6484,7 @@
     <w:p>
       <w:pPr>
         <w:spacing w:after="160" w:line="264"/>
+        <w:jc w:val="both"/>
       </w:pPr>
       <w:r>
         <w:rPr>
@@ -5896,6 +6498,7 @@
     <w:p>
       <w:pPr>
         <w:spacing w:after="160" w:line="264"/>
+        <w:jc w:val="both"/>
       </w:pPr>
       <w:r>
         <w:rPr>
@@ -5909,6 +6512,7 @@
     <w:p>
       <w:pPr>
         <w:spacing w:after="160" w:line="264"/>
+        <w:jc w:val="both"/>
       </w:pPr>
       <w:r>
         <w:rPr>
@@ -5922,6 +6526,7 @@
     <w:p>
       <w:pPr>
         <w:spacing w:after="160" w:line="264"/>
+        <w:jc w:val="both"/>
       </w:pPr>
       <w:r>
         <w:rPr>

</xml_diff>

<commit_message>
Leave positioning column empty from Deleuze onward
Co-Authored-By: Claude Opus 5.5 <noreply@anthropic.com>
Claude-Session: https://claude.ai/code/session_01Emt8uw1GVwwbB5CLx64szz
</commit_message>
<xml_diff>
--- a/literature-review/Literature-Review_Melen.docx
+++ b/literature-review/Literature-Review_Melen.docx
@@ -1282,7 +1282,7 @@
                 <w:sz w:val="18"/>
                 <w:szCs w:val="18"/>
               </w:rPr>
-              <w:t xml:space="preserve">On p. 32, Deleuze writes that the prison "constitutes a visibility" and is "a system of light before being a figure of stone", and introduces Foucault's distinction between "the visible and the articulable". The register of knowledge in this research can be discussed through this distinction.</w:t>
+              <w:t xml:space="preserve">On p. 32, Deleuze writes that the prison "constitutes a visibility" and is "a system of light before being a figure of stone", and introduces Foucault's distinction between "the visible and the articulable". The register of knowledge in this research can be discussed through this distinction. Architectural approach: weak.</w:t>
             </w:r>
           </w:p>
         </w:tc>
@@ -1307,14 +1307,6 @@
               <w:keepLines w:val="false"/>
               <w:spacing w:after="0" w:line="240"/>
             </w:pPr>
-            <w:r>
-              <w:rPr>
-                <w:rFonts w:ascii="Urbanist" w:cs="Urbanist" w:eastAsia="Urbanist" w:hAnsi="Urbanist"/>
-                <w:sz w:val="18"/>
-                <w:szCs w:val="18"/>
-              </w:rPr>
-              <w:t xml:space="preserve">Architectural approach: Weak</w:t>
-            </w:r>
           </w:p>
         </w:tc>
         <w:tc>
@@ -1462,7 +1454,7 @@
                 <w:sz w:val="18"/>
                 <w:szCs w:val="18"/>
               </w:rPr>
-              <w:t xml:space="preserve">According to the publisher's abstract, in the old city of Mardin "the transition to centralized modern supply" transformed "the visibility, accessibility, use, and situated knowledge of water", and the study reconstructs the relationships "between partially concealed infrastructure and visible urban form".</w:t>
+              <w:t xml:space="preserve">According to the publisher's abstract, in the old city of Mardin "the transition to centralized modern supply" transformed "the visibility, accessibility, use, and situated knowledge of water", and the study reconstructs the relationships "between partially concealed infrastructure and visible urban form". Architectural approach: strong.</w:t>
             </w:r>
           </w:p>
         </w:tc>
@@ -1487,14 +1479,6 @@
               <w:keepLines w:val="false"/>
               <w:spacing w:after="0" w:line="240"/>
             </w:pPr>
-            <w:r>
-              <w:rPr>
-                <w:rFonts w:ascii="Urbanist" w:cs="Urbanist" w:eastAsia="Urbanist" w:hAnsi="Urbanist"/>
-                <w:sz w:val="18"/>
-                <w:szCs w:val="18"/>
-              </w:rPr>
-              <w:t xml:space="preserve">Architectural approach: Strong</w:t>
-            </w:r>
           </w:p>
         </w:tc>
         <w:tc>
@@ -1642,7 +1626,7 @@
                 <w:sz w:val="18"/>
                 <w:szCs w:val="18"/>
               </w:rPr>
-              <w:t xml:space="preserve">According to the abstract, the article draws on "translation theory, which is essentially about the reinterpretation, appropriation, and representation of interests related to materials", and shows that "the translation of the underground by project actors hampered the necessary relocation of utilities". The register of knowledge can be traced in this account of underground utilities.</w:t>
+              <w:t xml:space="preserve">According to the abstract, the article draws on "translation theory, which is essentially about the reinterpretation, appropriation, and representation of interests related to materials", and shows that "the translation of the underground by project actors hampered the necessary relocation of utilities". The register of knowledge can be traced in this account of underground utilities. Architectural approach: weak.</w:t>
             </w:r>
           </w:p>
         </w:tc>
@@ -1667,14 +1651,6 @@
               <w:keepLines w:val="false"/>
               <w:spacing w:after="0" w:line="240"/>
             </w:pPr>
-            <w:r>
-              <w:rPr>
-                <w:rFonts w:ascii="Urbanist" w:cs="Urbanist" w:eastAsia="Urbanist" w:hAnsi="Urbanist"/>
-                <w:sz w:val="18"/>
-                <w:szCs w:val="18"/>
-              </w:rPr>
-              <w:t xml:space="preserve">Architectural approach: Weak</w:t>
-            </w:r>
           </w:p>
         </w:tc>
         <w:tc>
@@ -1804,7 +1780,7 @@
                 <w:sz w:val="18"/>
                 <w:szCs w:val="18"/>
               </w:rPr>
-              <w:t xml:space="preserve">According to the publisher's abstract, the authors "emphasize the role of invisibility in the process by which classification orders human interaction", examine "how categories are made and kept invisible, and how people can change this invisibility when necessary", and treat systems of classification "as part of the built information environment". The register of knowledge can be traced through this account of classification.</w:t>
+              <w:t xml:space="preserve">According to the publisher's abstract, the authors "emphasize the role of invisibility in the process by which classification orders human interaction", examine "how categories are made and kept invisible, and how people can change this invisibility when necessary", and treat systems of classification "as part of the built information environment". The register of knowledge can be traced through this account of classification. Architectural approach: weak.</w:t>
             </w:r>
           </w:p>
         </w:tc>
@@ -1829,14 +1805,6 @@
               <w:keepLines w:val="false"/>
               <w:spacing w:after="0" w:line="240"/>
             </w:pPr>
-            <w:r>
-              <w:rPr>
-                <w:rFonts w:ascii="Urbanist" w:cs="Urbanist" w:eastAsia="Urbanist" w:hAnsi="Urbanist"/>
-                <w:sz w:val="18"/>
-                <w:szCs w:val="18"/>
-              </w:rPr>
-              <w:t xml:space="preserve">Architectural approach: Weak</w:t>
-            </w:r>
           </w:p>
         </w:tc>
         <w:tc>
@@ -1966,7 +1934,7 @@
                 <w:sz w:val="18"/>
                 <w:szCs w:val="18"/>
               </w:rPr>
-              <w:t xml:space="preserve">According to the publisher's description, rivers are treated as "products of human design and a particular way of seeing that has roots stretching as far back as ancient Greek cartography", and the book traces how the Ganges "has been pictured, mapped, surveyed, explored, and measured across the millennia"; its first chapter is titled "Alexander's Eye and Ganga's Descent". The register of representation can be discussed through this way of seeing.</w:t>
+              <w:t xml:space="preserve">According to the publisher's description, rivers are treated as "products of human design and a particular way of seeing that has roots stretching as far back as ancient Greek cartography", and the book traces how the Ganges "has been pictured, mapped, surveyed, explored, and measured across the millennia"; its first chapter is titled "Alexander's Eye and Ganga's Descent". The register of representation can be discussed through this way of seeing. Architectural approach: strong.</w:t>
             </w:r>
           </w:p>
         </w:tc>
@@ -1991,14 +1959,6 @@
               <w:keepLines w:val="false"/>
               <w:spacing w:after="0" w:line="240"/>
             </w:pPr>
-            <w:r>
-              <w:rPr>
-                <w:rFonts w:ascii="Urbanist" w:cs="Urbanist" w:eastAsia="Urbanist" w:hAnsi="Urbanist"/>
-                <w:sz w:val="18"/>
-                <w:szCs w:val="18"/>
-              </w:rPr>
-              <w:t xml:space="preserve">Architectural approach: Strong</w:t>
-            </w:r>
           </w:p>
         </w:tc>
         <w:tc>
@@ -2128,7 +2088,7 @@
                 <w:sz w:val="18"/>
                 <w:szCs w:val="18"/>
               </w:rPr>
-              <w:t xml:space="preserve">According to the publisher's description, "infrastructure sets the invisible rules that govern the spaces of our everyday lives", and the book reveals governmental and corporate forces "buried within the concrete and fiber-optics of our modern habitat". The register of knowledge can be discussed in relation to these "invisible rules" of infrastructure space.</w:t>
+              <w:t xml:space="preserve">According to the publisher's description, "infrastructure sets the invisible rules that govern the spaces of our everyday lives", and the book reveals governmental and corporate forces "buried within the concrete and fiber-optics of our modern habitat". The register of knowledge can be discussed in relation to these "invisible rules" of infrastructure space. Architectural approach: strong.</w:t>
             </w:r>
           </w:p>
         </w:tc>
@@ -2153,14 +2113,6 @@
               <w:keepLines w:val="false"/>
               <w:spacing w:after="0" w:line="240"/>
             </w:pPr>
-            <w:r>
-              <w:rPr>
-                <w:rFonts w:ascii="Urbanist" w:cs="Urbanist" w:eastAsia="Urbanist" w:hAnsi="Urbanist"/>
-                <w:sz w:val="18"/>
-                <w:szCs w:val="18"/>
-              </w:rPr>
-              <w:t xml:space="preserve">Architectural approach: Strong</w:t>
-            </w:r>
           </w:p>
         </w:tc>
         <w:tc>
@@ -2290,7 +2242,7 @@
                 <w:sz w:val="18"/>
                 <w:szCs w:val="18"/>
               </w:rPr>
-              <w:t xml:space="preserve">According to the publisher's abstract, water lies "at the intersection of landscape and infrastructure, crossing between visible and invisible domains of urban space"; the book begins with "the Parisian sewers of the nineteenth century, captured in the photographs of Nadar" and addresses Berlin's "protection of public access to lakes for swimming". The registers of representation and access can be read in these cases.</w:t>
+              <w:t xml:space="preserve">According to the publisher's abstract, water lies "at the intersection of landscape and infrastructure, crossing between visible and invisible domains of urban space"; the book begins with "the Parisian sewers of the nineteenth century, captured in the photographs of Nadar" and addresses Berlin's "protection of public access to lakes for swimming". The registers of representation and access can be read in these cases. Architectural approach: strong.</w:t>
             </w:r>
           </w:p>
         </w:tc>
@@ -2315,14 +2267,6 @@
               <w:keepLines w:val="false"/>
               <w:spacing w:after="0" w:line="240"/>
             </w:pPr>
-            <w:r>
-              <w:rPr>
-                <w:rFonts w:ascii="Urbanist" w:cs="Urbanist" w:eastAsia="Urbanist" w:hAnsi="Urbanist"/>
-                <w:sz w:val="18"/>
-                <w:szCs w:val="18"/>
-              </w:rPr>
-              <w:t xml:space="preserve">Architectural approach: Strong</w:t>
-            </w:r>
           </w:p>
         </w:tc>
         <w:tc>
@@ -2452,7 +2396,7 @@
                 <w:sz w:val="18"/>
                 <w:szCs w:val="18"/>
               </w:rPr>
-              <w:t xml:space="preserve">The publisher's description opens with the question: "How are the far-away, invisible landscapes where materials come from related to the highly visible, urban landscapes where those same materials are installed?" The book traces five construction materials "from seminal public landscapes in New York City, back to where they came from".</w:t>
+              <w:t xml:space="preserve">The publisher's description opens with the question: "How are the far-away, invisible landscapes where materials come from related to the highly visible, urban landscapes where those same materials are installed?" The book traces five construction materials "from seminal public landscapes in New York City, back to where they came from". Architectural approach: strong.</w:t>
             </w:r>
           </w:p>
         </w:tc>
@@ -2477,14 +2421,6 @@
               <w:keepLines w:val="false"/>
               <w:spacing w:after="0" w:line="240"/>
             </w:pPr>
-            <w:r>
-              <w:rPr>
-                <w:rFonts w:ascii="Urbanist" w:cs="Urbanist" w:eastAsia="Urbanist" w:hAnsi="Urbanist"/>
-                <w:sz w:val="18"/>
-                <w:szCs w:val="18"/>
-              </w:rPr>
-              <w:t xml:space="preserve">Architectural approach: Strong</w:t>
-            </w:r>
           </w:p>
         </w:tc>
         <w:tc>
@@ -2632,7 +2568,7 @@
                 <w:sz w:val="18"/>
                 <w:szCs w:val="18"/>
               </w:rPr>
-              <w:t xml:space="preserve">According to the publisher's abstract, the article analyses "the iconography and symbolism of dam constructions" through the Marathon dam, which "became an iconic marker of Athens's modernization" and was "veneered with the same marble as that used for the Parthenon", read as an effort "to reconcile iconographically the two prevailing geographical imaginations" of the city. The register of representation can be located in this reading of the dam as architecture.</w:t>
+              <w:t xml:space="preserve">According to the publisher's abstract, the article analyses "the iconography and symbolism of dam constructions" through the Marathon dam, which "became an iconic marker of Athens's modernization" and was "veneered with the same marble as that used for the Parthenon", read as an effort "to reconcile iconographically the two prevailing geographical imaginations" of the city. The register of representation can be located in this reading of the dam as architecture. Architectural approach: strong.</w:t>
             </w:r>
           </w:p>
         </w:tc>
@@ -2657,14 +2593,6 @@
               <w:keepLines w:val="false"/>
               <w:spacing w:after="0" w:line="240"/>
             </w:pPr>
-            <w:r>
-              <w:rPr>
-                <w:rFonts w:ascii="Urbanist" w:cs="Urbanist" w:eastAsia="Urbanist" w:hAnsi="Urbanist"/>
-                <w:sz w:val="18"/>
-                <w:szCs w:val="18"/>
-              </w:rPr>
-              <w:t xml:space="preserve">Architectural approach: Strong</w:t>
-            </w:r>
           </w:p>
         </w:tc>
         <w:tc>
@@ -2812,7 +2740,7 @@
                 <w:sz w:val="18"/>
                 <w:szCs w:val="18"/>
               </w:rPr>
-              <w:t xml:space="preserve">According to the publisher's abstract, "Burying the flow of water via subterranean and often distant pinpointed technological mediations (dams, purification plants, pumping stations) facilitates and contributes to masking the social relations through which the metabolic urbanization of water takes place"; in early modernity such structures "were celebrated as glorious icons, carefully designed, ornamented and prominently located in the city", whereas in high modernity they "began to disappear from the cityscape" and "from the urban imagination".</w:t>
+              <w:t xml:space="preserve">According to the publisher's abstract, "Burying the flow of water via subterranean and often distant pinpointed technological mediations (dams, purification plants, pumping stations) facilitates and contributes to masking the social relations through which the metabolic urbanization of water takes place"; in early modernity such structures "were celebrated as glorious icons, carefully designed, ornamented and prominently located in the city", whereas in high modernity they "began to disappear from the cityscape" and "from the urban imagination". Architectural approach: strong.</w:t>
             </w:r>
           </w:p>
         </w:tc>
@@ -2837,14 +2765,6 @@
               <w:keepLines w:val="false"/>
               <w:spacing w:after="0" w:line="240"/>
             </w:pPr>
-            <w:r>
-              <w:rPr>
-                <w:rFonts w:ascii="Urbanist" w:cs="Urbanist" w:eastAsia="Urbanist" w:hAnsi="Urbanist"/>
-                <w:sz w:val="18"/>
-                <w:szCs w:val="18"/>
-              </w:rPr>
-              <w:t xml:space="preserve">Architectural approach: Strong</w:t>
-            </w:r>
           </w:p>
         </w:tc>
         <w:tc>
@@ -2974,7 +2894,7 @@
                 <w:sz w:val="18"/>
                 <w:szCs w:val="18"/>
               </w:rPr>
-              <w:t xml:space="preserve">According to the abstract of this master's thesis, the "'Modern Water' understanding of today sees water as a service to be provided and makes it invisible to users", causing "lack of awareness, responsibility and loss of a socio-cultural value". The thesis concerns Istanbul, the city supplied by the Melen Water Supply Project.</w:t>
+              <w:t xml:space="preserve">According to the abstract of this master's thesis, the "'Modern Water' understanding of today sees water as a service to be provided and makes it invisible to users", causing "lack of awareness, responsibility and loss of a socio-cultural value". The thesis concerns Istanbul, the city supplied by the Melen Water Supply Project. Architectural approach: strong.</w:t>
             </w:r>
           </w:p>
         </w:tc>
@@ -2999,14 +2919,6 @@
               <w:keepLines w:val="false"/>
               <w:spacing w:after="0" w:line="240"/>
             </w:pPr>
-            <w:r>
-              <w:rPr>
-                <w:rFonts w:ascii="Urbanist" w:cs="Urbanist" w:eastAsia="Urbanist" w:hAnsi="Urbanist"/>
-                <w:sz w:val="18"/>
-                <w:szCs w:val="18"/>
-              </w:rPr>
-              <w:t xml:space="preserve">Architectural approach: Strong</w:t>
-            </w:r>
           </w:p>
         </w:tc>
         <w:tc>
@@ -3154,7 +3066,7 @@
                 <w:sz w:val="18"/>
                 <w:szCs w:val="18"/>
               </w:rPr>
-              <w:t xml:space="preserve">According to the publisher's abstract, the essay maps out "visual studies as an emergent academic formation", questions "the overturning of 'scopic regimes'" and concludes with an exercise the author calls "showing seeing". The source can frame the positioning of this research in relation to visual culture.</w:t>
+              <w:t xml:space="preserve">According to the publisher's abstract, the essay maps out "visual studies as an emergent academic formation", questions "the overturning of 'scopic regimes'" and concludes with an exercise the author calls "showing seeing". The source can frame the positioning of this research in relation to visual culture. Architectural approach: weak.</w:t>
             </w:r>
           </w:p>
         </w:tc>
@@ -3179,14 +3091,6 @@
               <w:keepLines w:val="false"/>
               <w:spacing w:after="0" w:line="240"/>
             </w:pPr>
-            <w:r>
-              <w:rPr>
-                <w:rFonts w:ascii="Urbanist" w:cs="Urbanist" w:eastAsia="Urbanist" w:hAnsi="Urbanist"/>
-                <w:sz w:val="18"/>
-                <w:szCs w:val="18"/>
-              </w:rPr>
-              <w:t xml:space="preserve">Architectural approach: Weak</w:t>
-            </w:r>
           </w:p>
         </w:tc>
         <w:tc>
@@ -3316,7 +3220,7 @@
                 <w:sz w:val="18"/>
                 <w:szCs w:val="18"/>
               </w:rPr>
-              <w:t xml:space="preserve">The essay, open access in Places Journal, discusses tours, audio guides and artistic projects that aim to "make visible the invisible", including a project that highlights what remains "at the periphery of visibility," what seems "illegible or even un-mappable". The registers of publicness and legibility can be discussed through these practices of infrastructural tourism.</w:t>
+              <w:t xml:space="preserve">The essay, open access in Places Journal, discusses tours, audio guides and artistic projects that aim to "make visible the invisible", including a project that highlights what remains "at the periphery of visibility," what seems "illegible or even un-mappable". The registers of publicness and legibility can be discussed through these practices of infrastructural tourism. Architectural approach: strong.</w:t>
             </w:r>
           </w:p>
         </w:tc>
@@ -3341,14 +3245,6 @@
               <w:keepLines w:val="false"/>
               <w:spacing w:after="0" w:line="240"/>
             </w:pPr>
-            <w:r>
-              <w:rPr>
-                <w:rFonts w:ascii="Urbanist" w:cs="Urbanist" w:eastAsia="Urbanist" w:hAnsi="Urbanist"/>
-                <w:sz w:val="18"/>
-                <w:szCs w:val="18"/>
-              </w:rPr>
-              <w:t xml:space="preserve">Architectural approach: Strong</w:t>
-            </w:r>
           </w:p>
         </w:tc>
         <w:tc>
@@ -3478,7 +3374,7 @@
                 <w:sz w:val="18"/>
                 <w:szCs w:val="18"/>
               </w:rPr>
-              <w:t xml:space="preserve">The first chapter, "A Dam Site More Modern: Developing TVA Monumentality in Visual Culture" (pp. 24-56), situates the infrastructure of the Tennessee Valley Authority within visual culture. The register of representation can be located in this material.</w:t>
+              <w:t xml:space="preserve">The first chapter, "A Dam Site More Modern: Developing TVA Monumentality in Visual Culture" (pp. 24-56), situates the infrastructure of the Tennessee Valley Authority within visual culture. The register of representation can be located in this material. Architectural approach: strong.</w:t>
             </w:r>
           </w:p>
         </w:tc>
@@ -3503,14 +3399,6 @@
               <w:keepLines w:val="false"/>
               <w:spacing w:after="0" w:line="240"/>
             </w:pPr>
-            <w:r>
-              <w:rPr>
-                <w:rFonts w:ascii="Urbanist" w:cs="Urbanist" w:eastAsia="Urbanist" w:hAnsi="Urbanist"/>
-                <w:sz w:val="18"/>
-                <w:szCs w:val="18"/>
-              </w:rPr>
-              <w:t xml:space="preserve">Architectural approach: Strong</w:t>
-            </w:r>
           </w:p>
         </w:tc>
         <w:tc>
@@ -3658,7 +3546,7 @@
                 <w:sz w:val="18"/>
                 <w:szCs w:val="18"/>
               </w:rPr>
-              <w:t xml:space="preserve">According to the publisher's abstract, the article explores "the politics of infrastructure in Jakarta through the lens of in/visibility", notes that infrastructure studies has tended to categorise infrastructure "as either hyper-visible by design, or invisible until breakdown", and argues that "spectacular, visible infrastructures generate public and political attention, while below ground, hidden and invisible infrastructures are overlooked". The register of publicness can be discussed through this "politics of visibility".</w:t>
+              <w:t xml:space="preserve">According to the publisher's abstract, the article explores "the politics of infrastructure in Jakarta through the lens of in/visibility", notes that infrastructure studies has tended to categorise infrastructure "as either hyper-visible by design, or invisible until breakdown", and argues that "spectacular, visible infrastructures generate public and political attention, while below ground, hidden and invisible infrastructures are overlooked". The register of publicness can be discussed through this "politics of visibility". Architectural approach: weak.</w:t>
             </w:r>
           </w:p>
         </w:tc>
@@ -3683,14 +3571,6 @@
               <w:keepLines w:val="false"/>
               <w:spacing w:after="0" w:line="240"/>
             </w:pPr>
-            <w:r>
-              <w:rPr>
-                <w:rFonts w:ascii="Urbanist" w:cs="Urbanist" w:eastAsia="Urbanist" w:hAnsi="Urbanist"/>
-                <w:sz w:val="18"/>
-                <w:szCs w:val="18"/>
-              </w:rPr>
-              <w:t xml:space="preserve">Architectural approach: Weak</w:t>
-            </w:r>
           </w:p>
         </w:tc>
         <w:tc>
@@ -3820,7 +3700,7 @@
                 <w:sz w:val="18"/>
                 <w:szCs w:val="18"/>
               </w:rPr>
-              <w:t xml:space="preserve">According to the chapter abstract, Kambic examines "three responses to inaccessible water infrastructure" in Los Angeles, namely "accepting the situation, incremental infrastructure, and the Cyborg City", under the title of urban water visibility, legibility and access. The registers of legibility and access can be read in these responses.</w:t>
+              <w:t xml:space="preserve">According to the chapter abstract, Kambic examines "three responses to inaccessible water infrastructure" in Los Angeles, namely "accepting the situation, incremental infrastructure, and the Cyborg City", under the title of urban water visibility, legibility and access. The registers of legibility and access can be read in these responses. Architectural approach: weak.</w:t>
             </w:r>
           </w:p>
         </w:tc>
@@ -3845,14 +3725,6 @@
               <w:keepLines w:val="false"/>
               <w:spacing w:after="0" w:line="240"/>
             </w:pPr>
-            <w:r>
-              <w:rPr>
-                <w:rFonts w:ascii="Urbanist" w:cs="Urbanist" w:eastAsia="Urbanist" w:hAnsi="Urbanist"/>
-                <w:sz w:val="18"/>
-                <w:szCs w:val="18"/>
-              </w:rPr>
-              <w:t xml:space="preserve">Architectural approach: Weak</w:t>
-            </w:r>
           </w:p>
         </w:tc>
         <w:tc>
@@ -3982,7 +3854,7 @@
                 <w:sz w:val="18"/>
                 <w:szCs w:val="18"/>
               </w:rPr>
-              <w:t xml:space="preserve">The title presents the Aqueduct of Valens as "Byzantine heritage depicted", and the abstract states that the aqueduct "maintained its critical operation for supplying water and, at the same time protected its urban presence in the urban topography". The register of representation can be located in the depictions of a water structure of Istanbul.</w:t>
+              <w:t xml:space="preserve">The title presents the Aqueduct of Valens as "Byzantine heritage depicted", and the abstract states that the aqueduct "maintained its critical operation for supplying water and, at the same time protected its urban presence in the urban topography". The register of representation can be located in the depictions of a water structure of Istanbul. Architectural approach: strong.</w:t>
             </w:r>
           </w:p>
         </w:tc>
@@ -4007,14 +3879,6 @@
               <w:keepLines w:val="false"/>
               <w:spacing w:after="0" w:line="240"/>
             </w:pPr>
-            <w:r>
-              <w:rPr>
-                <w:rFonts w:ascii="Urbanist" w:cs="Urbanist" w:eastAsia="Urbanist" w:hAnsi="Urbanist"/>
-                <w:sz w:val="18"/>
-                <w:szCs w:val="18"/>
-              </w:rPr>
-              <w:t xml:space="preserve">Architectural approach: Strong</w:t>
-            </w:r>
           </w:p>
         </w:tc>
         <w:tc>
@@ -4322,7 +4186,7 @@
                 <w:sz w:val="18"/>
                 <w:szCs w:val="18"/>
               </w:rPr>
-              <w:t xml:space="preserve">According to the publisher's description, the architectural projects of the book become "a medium to synthesize different forms and scales of knowledge on technological externalities", among them water shortage, and revisit "devices of wonder that assemble publics around representations of the Earth". The registers of representation and publicness can be discussed through this design research.</w:t>
+              <w:t xml:space="preserve">According to the publisher's description, the architectural projects of the book become "a medium to synthesize different forms and scales of knowledge on technological externalities", among them water shortage, and revisit "devices of wonder that assemble publics around representations of the Earth". The registers of representation and publicness can be discussed through this design research. Architectural approach: strong.</w:t>
             </w:r>
           </w:p>
         </w:tc>
@@ -4347,14 +4211,6 @@
               <w:keepLines w:val="false"/>
               <w:spacing w:after="0" w:line="240"/>
             </w:pPr>
-            <w:r>
-              <w:rPr>
-                <w:rFonts w:ascii="Urbanist" w:cs="Urbanist" w:eastAsia="Urbanist" w:hAnsi="Urbanist"/>
-                <w:sz w:val="18"/>
-                <w:szCs w:val="18"/>
-              </w:rPr>
-              <w:t xml:space="preserve">Architectural approach: Strong</w:t>
-            </w:r>
           </w:p>
         </w:tc>
         <w:tc>
@@ -4484,7 +4340,7 @@
                 <w:sz w:val="18"/>
                 <w:szCs w:val="18"/>
               </w:rPr>
-              <w:t xml:space="preserve">The record held for this review is limited to the bibliographic details and a book review; the book addresses the Mississippi floods through "designing a shifting landscape", as its title states. Its relation to the register of representation remains to be established by reading.</w:t>
+              <w:t xml:space="preserve">The record held for this review is limited to the bibliographic details and a book review; the book addresses the Mississippi floods through "designing a shifting landscape", as its title states. Its relation to the register of representation remains to be established by reading. Architectural approach: strong.</w:t>
             </w:r>
           </w:p>
         </w:tc>
@@ -4509,14 +4365,6 @@
               <w:keepLines w:val="false"/>
               <w:spacing w:after="0" w:line="240"/>
             </w:pPr>
-            <w:r>
-              <w:rPr>
-                <w:rFonts w:ascii="Urbanist" w:cs="Urbanist" w:eastAsia="Urbanist" w:hAnsi="Urbanist"/>
-                <w:sz w:val="18"/>
-                <w:szCs w:val="18"/>
-              </w:rPr>
-              <w:t xml:space="preserve">Architectural approach: Strong</w:t>
-            </w:r>
           </w:p>
         </w:tc>
         <w:tc>
@@ -4664,7 +4512,7 @@
                 <w:sz w:val="18"/>
                 <w:szCs w:val="18"/>
               </w:rPr>
-              <w:t xml:space="preserve">A short text (pp. 35-37) in the Journal of Architectural Education titled "Aqueous Terrain". The record held for this review is limited to the bibliographic details; its relation to the question of visibility remains to be established by reading.</w:t>
+              <w:t xml:space="preserve">A short text (pp. 35-37) in the Journal of Architectural Education titled "Aqueous Terrain". The record held for this review is limited to the bibliographic details; its relation to the question of visibility remains to be established by reading. Architectural approach: strong.</w:t>
             </w:r>
           </w:p>
         </w:tc>
@@ -4689,14 +4537,6 @@
               <w:keepLines w:val="false"/>
               <w:spacing w:after="0" w:line="240"/>
             </w:pPr>
-            <w:r>
-              <w:rPr>
-                <w:rFonts w:ascii="Urbanist" w:cs="Urbanist" w:eastAsia="Urbanist" w:hAnsi="Urbanist"/>
-                <w:sz w:val="18"/>
-                <w:szCs w:val="18"/>
-              </w:rPr>
-              <w:t xml:space="preserve">Architectural approach: Strong</w:t>
-            </w:r>
           </w:p>
         </w:tc>
         <w:tc>
@@ -4826,7 +4666,7 @@
                 <w:sz w:val="18"/>
                 <w:szCs w:val="18"/>
               </w:rPr>
-              <w:t xml:space="preserve">The review of the book in Places Journal describes Los Angeles as depending "upon vast infrastructural systems that are breathtakingly complex, yet vulnerable to disruption, even disaster". The book is an edited volume on the networked ecologies of the city; its chapters remain to be read for the question of visibility.</w:t>
+              <w:t xml:space="preserve">The review of the book in Places Journal describes Los Angeles as depending "upon vast infrastructural systems that are breathtakingly complex, yet vulnerable to disruption, even disaster". The book is an edited volume on the networked ecologies of the city; its chapters remain to be read for the question of visibility. Architectural approach: strong.</w:t>
             </w:r>
           </w:p>
         </w:tc>
@@ -4851,14 +4691,6 @@
               <w:keepLines w:val="false"/>
               <w:spacing w:after="0" w:line="240"/>
             </w:pPr>
-            <w:r>
-              <w:rPr>
-                <w:rFonts w:ascii="Urbanist" w:cs="Urbanist" w:eastAsia="Urbanist" w:hAnsi="Urbanist"/>
-                <w:sz w:val="18"/>
-                <w:szCs w:val="18"/>
-              </w:rPr>
-              <w:t xml:space="preserve">Architectural approach: Strong</w:t>
-            </w:r>
           </w:p>
         </w:tc>
         <w:tc>
@@ -5166,7 +4998,7 @@
                 <w:sz w:val="18"/>
                 <w:szCs w:val="18"/>
               </w:rPr>
-              <w:t xml:space="preserve">According to the book description, people have created around water "an extensive tangible network of infrastructure, buildings, and urban form", while today "heritage and water are largely two separate disciplinary and professional fields"; the volume links the two through twenty-one chapters.</w:t>
+              <w:t xml:space="preserve">According to the book description, people have created around water "an extensive tangible network of infrastructure, buildings, and urban form", while today "heritage and water are largely two separate disciplinary and professional fields"; the volume links the two through twenty-one chapters. Architectural approach: strong.</w:t>
             </w:r>
           </w:p>
         </w:tc>
@@ -5191,14 +5023,6 @@
               <w:keepLines w:val="false"/>
               <w:spacing w:after="0" w:line="240"/>
             </w:pPr>
-            <w:r>
-              <w:rPr>
-                <w:rFonts w:ascii="Urbanist" w:cs="Urbanist" w:eastAsia="Urbanist" w:hAnsi="Urbanist"/>
-                <w:sz w:val="18"/>
-                <w:szCs w:val="18"/>
-              </w:rPr>
-              <w:t xml:space="preserve">Architectural approach: Strong</w:t>
-            </w:r>
           </w:p>
         </w:tc>
         <w:tc>
@@ -5506,7 +5330,7 @@
                 <w:sz w:val="18"/>
                 <w:szCs w:val="18"/>
               </w:rPr>
-              <w:t xml:space="preserve">A course description of the MIT Department of Architecture, cited in this research; it is not a publication, and the texts on its reading list can be consulted as citable sources.</w:t>
+              <w:t xml:space="preserve">A course description of the MIT Department of Architecture, cited in this research; it is not a publication, and the texts on its reading list can be consulted as citable sources. Architectural approach: strong.</w:t>
             </w:r>
           </w:p>
         </w:tc>
@@ -5531,14 +5355,6 @@
               <w:keepLines w:val="false"/>
               <w:spacing w:after="0" w:line="240"/>
             </w:pPr>
-            <w:r>
-              <w:rPr>
-                <w:rFonts w:ascii="Urbanist" w:cs="Urbanist" w:eastAsia="Urbanist" w:hAnsi="Urbanist"/>
-                <w:sz w:val="18"/>
-                <w:szCs w:val="18"/>
-              </w:rPr>
-              <w:t xml:space="preserve">Architectural approach: Strong</w:t>
-            </w:r>
           </w:p>
         </w:tc>
         <w:tc>
@@ -5846,7 +5662,7 @@
                 <w:sz w:val="18"/>
                 <w:szCs w:val="18"/>
               </w:rPr>
-              <w:t xml:space="preserve">As the title states, the chapter traces how "a humble French engineering term shaped the modern world". It can serve the definition of the term infrastructure in this research.</w:t>
+              <w:t xml:space="preserve">As the title states, the chapter traces how "a humble French engineering term shaped the modern world". It can serve the definition of the term infrastructure in this research. Architectural approach: weak.</w:t>
             </w:r>
           </w:p>
         </w:tc>
@@ -5871,14 +5687,6 @@
               <w:keepLines w:val="false"/>
               <w:spacing w:after="0" w:line="240"/>
             </w:pPr>
-            <w:r>
-              <w:rPr>
-                <w:rFonts w:ascii="Urbanist" w:cs="Urbanist" w:eastAsia="Urbanist" w:hAnsi="Urbanist"/>
-                <w:sz w:val="18"/>
-                <w:szCs w:val="18"/>
-              </w:rPr>
-              <w:t xml:space="preserve">Architectural approach: Weak</w:t>
-            </w:r>
           </w:p>
         </w:tc>
         <w:tc>
@@ -6008,7 +5816,7 @@
                 <w:sz w:val="18"/>
                 <w:szCs w:val="18"/>
               </w:rPr>
-              <w:t xml:space="preserve">According to the publisher's description, the book analyses "the complex interactions between infrastructure networks and urban spaces", including "infrastructure and the built environment", under the notion of splintering urbanism.</w:t>
+              <w:t xml:space="preserve">According to the publisher's description, the book analyses "the complex interactions between infrastructure networks and urban spaces", including "infrastructure and the built environment", under the notion of splintering urbanism. Architectural approach: weak.</w:t>
             </w:r>
           </w:p>
         </w:tc>
@@ -6033,14 +5841,6 @@
               <w:keepLines w:val="false"/>
               <w:spacing w:after="0" w:line="240"/>
             </w:pPr>
-            <w:r>
-              <w:rPr>
-                <w:rFonts w:ascii="Urbanist" w:cs="Urbanist" w:eastAsia="Urbanist" w:hAnsi="Urbanist"/>
-                <w:sz w:val="18"/>
-                <w:szCs w:val="18"/>
-              </w:rPr>
-              <w:t xml:space="preserve">Architectural approach: Weak</w:t>
-            </w:r>
           </w:p>
         </w:tc>
         <w:tc>
@@ -6348,7 +6148,7 @@
                 <w:sz w:val="18"/>
                 <w:szCs w:val="18"/>
               </w:rPr>
-              <w:t xml:space="preserve">According to the abstract of this master's thesis (MIT Department of Architecture, advised by William Porter and Sibel Bozdoğan), the work is about "water infrastructure and its experience as urban and natural space", analysing "water dams and reservoirs that are more than utilitarian structures" through the concept of "ARTIFICIAL NATURE", with sites "from Thrace to Central and Southeastern Anatolia in Turkey from 1920-2000".</w:t>
+              <w:t xml:space="preserve">According to the abstract of this master's thesis (MIT Department of Architecture, advised by William Porter and Sibel Bozdoğan), the work is about "water infrastructure and its experience as urban and natural space", analysing "water dams and reservoirs that are more than utilitarian structures" through the concept of "ARTIFICIAL NATURE", with sites "from Thrace to Central and Southeastern Anatolia in Turkey from 1920-2000". Architectural approach: strong.</w:t>
             </w:r>
           </w:p>
         </w:tc>
@@ -6373,14 +6173,6 @@
               <w:keepLines w:val="false"/>
               <w:spacing w:after="0" w:line="240"/>
             </w:pPr>
-            <w:r>
-              <w:rPr>
-                <w:rFonts w:ascii="Urbanist" w:cs="Urbanist" w:eastAsia="Urbanist" w:hAnsi="Urbanist"/>
-                <w:sz w:val="18"/>
-                <w:szCs w:val="18"/>
-              </w:rPr>
-              <w:t xml:space="preserve">Architectural approach: Strong</w:t>
-            </w:r>
           </w:p>
         </w:tc>
         <w:tc>

</xml_diff>

<commit_message>
Set Murphy footnote to 7 pt
Co-Authored-By: Claude Opus 5.5 <noreply@anthropic.com>
Claude-Session: https://claude.ai/code/session_01Emt8uw1GVwwbB5CLx64szz
</commit_message>
<xml_diff>
--- a/literature-review/Literature-Review_Melen.docx
+++ b/literature-review/Literature-Review_Melen.docx
@@ -111,8 +111,8 @@
       <w:r>
         <w:rPr>
           <w:rFonts w:ascii="Urbanist" w:cs="Urbanist" w:eastAsia="Urbanist" w:hAnsi="Urbanist"/>
-          <w:sz w:val="16"/>
-          <w:szCs w:val="16"/>
+          <w:sz w:val="14"/>
+          <w:szCs w:val="14"/>
         </w:rPr>
         <w:t xml:space="preserve">*Murphy, C. E. (2024). Architectures of Water in Early Modernity. Massachusetts Institute of Technology, Department of Architecture. https://architecture.mit.edu/classes/special-subject-history-theory-criticism-architecture-art-architectures-water-early</w:t>
       </w:r>

</xml_diff>